<commit_message>
Adjusted SOW after feedback from professor. Included H0 and HA. Explicitly discussed findings from data checking, described missing data approach.
</commit_message>
<xml_diff>
--- a/Reports/SOW_Hengeveld_Draft.docx
+++ b/Reports/SOW_Hengeveld_Draft.docx
@@ -497,10 +497,13 @@
         <w:t xml:space="preserve">The question for this study </w:t>
       </w:r>
       <w:r>
-        <w:t>is,</w:t>
-      </w:r>
-      <w:r>
-        <w:t xml:space="preserve"> do</w:t>
+        <w:t>is</w:t>
+      </w:r>
+      <w:r>
+        <w:t xml:space="preserve"> </w:t>
+      </w:r>
+      <w:r>
+        <w:t>do</w:t>
       </w:r>
       <w:r>
         <w:t xml:space="preserve"> </w:t>
@@ -669,11 +672,6 @@
       </w:r>
     </w:p>
     <w:p>
-      <w:pPr>
-        <w:rPr>
-          <w:rFonts w:cs="Arial"/>
-        </w:rPr>
-      </w:pPr>
       <w:r>
         <w:rPr>
           <w:rFonts w:cs="Arial"/>
@@ -702,7 +700,7 @@
         <w:rPr>
           <w:rFonts w:cs="Arial"/>
         </w:rPr>
-        <w:t xml:space="preserve">Data was gathered across different resources and databases at the School of Medicine, and combined by Student ID. </w:t>
+        <w:t xml:space="preserve">Data was gathered across different resources and databases at the School of Medicine and combined by Student ID. </w:t>
       </w:r>
       <w:r>
         <w:rPr>
@@ -819,7 +817,23 @@
         <w:t>]</w:t>
       </w:r>
       <w:r>
-        <w:t xml:space="preserve">[Season][ScenarioName][ComponentScore]” such as </w:t>
+        <w:t>[Season][</w:t>
+      </w:r>
+      <w:proofErr w:type="spellStart"/>
+      <w:r>
+        <w:t>ScenarioName</w:t>
+      </w:r>
+      <w:proofErr w:type="spellEnd"/>
+      <w:r>
+        <w:t>][</w:t>
+      </w:r>
+      <w:proofErr w:type="spellStart"/>
+      <w:r>
+        <w:t>ComponentScore</w:t>
+      </w:r>
+      <w:proofErr w:type="spellEnd"/>
+      <w:r>
+        <w:t xml:space="preserve">]” such as </w:t>
       </w:r>
       <w:r>
         <w:t>“</w:t>
@@ -831,13 +845,83 @@
         <w:t>”</w:t>
       </w:r>
       <w:r>
-        <w:t xml:space="preserve">. The primary explanatory variables are URM status, either as defined by the University or by the AAMC. </w:t>
-      </w:r>
-      <w:r>
-        <w:t xml:space="preserve">Additional covariates </w:t>
-      </w:r>
-      <w:r>
-        <w:t xml:space="preserve">may include course grades, other exam scores, and gender. </w:t>
+        <w:t>. The primary explanatory variable</w:t>
+      </w:r>
+      <w:r>
+        <w:t xml:space="preserve"> is </w:t>
+      </w:r>
+      <w:r>
+        <w:t>URM status</w:t>
+      </w:r>
+      <w:r>
+        <w:t xml:space="preserve"> </w:t>
+      </w:r>
+      <w:r>
+        <w:t xml:space="preserve">as defined by the </w:t>
+      </w:r>
+      <w:r>
+        <w:t>School of Medicine</w:t>
+      </w:r>
+      <w:r>
+        <w:t>,</w:t>
+      </w:r>
+      <w:r>
+        <w:t xml:space="preserve"> </w:t>
+      </w:r>
+      <w:r>
+        <w:t>to improve interpretation and allow for more actionable recommendations based on the findings.</w:t>
+      </w:r>
+      <w:r>
+        <w:t xml:space="preserve"> </w:t>
+      </w:r>
+      <w:r>
+        <w:t xml:space="preserve">No additional covariates are being considered for this exploratory analysis. </w:t>
+      </w:r>
+    </w:p>
+    <w:p>
+      <w:r>
+        <w:t>Initial data checking reveals that 39 students were missing all 16 OSCE scores. The 39 missing cases vary across demographic variables, such as URM status, as well as test scores and class grades. These 39 will be excluded from the analysis, following a complete case analysis approach</w:t>
+      </w:r>
+      <w:r>
+        <w:t xml:space="preserve">, leaving an analytical sample size of 160 students. </w:t>
+      </w:r>
+    </w:p>
+    <w:p>
+      <w:r>
+        <w:t>For this analysis, w</w:t>
+      </w:r>
+      <w:r>
+        <w:t xml:space="preserve">e will create three constructed OSCE variables: </w:t>
+      </w:r>
+      <w:proofErr w:type="spellStart"/>
+      <w:r>
+        <w:t>CommScore</w:t>
+      </w:r>
+      <w:proofErr w:type="spellEnd"/>
+      <w:r>
+        <w:t xml:space="preserve">, </w:t>
+      </w:r>
+      <w:proofErr w:type="spellStart"/>
+      <w:r>
+        <w:t>PhysExamScore</w:t>
+      </w:r>
+      <w:proofErr w:type="spellEnd"/>
+      <w:r>
+        <w:t xml:space="preserve">, and </w:t>
+      </w:r>
+      <w:proofErr w:type="spellStart"/>
+      <w:r>
+        <w:t>MedDocScore</w:t>
+      </w:r>
+      <w:proofErr w:type="spellEnd"/>
+      <w:r>
+        <w:t>, which will be the mean of the Bates, Ramos, Payne, Hyde and Snelling scores for each component. If any participant is missing more than 2 of the component scores to create the mean, they will have a missing value for the constructed variable in question. Using the mean score across the five scenarios allows us to account for missing scenario scores in the case that a student has a score missing for one or two of the scenarios.</w:t>
+      </w:r>
+      <w:r>
+        <w:t xml:space="preserve"> This approach preserves more </w:t>
+      </w:r>
+      <w:r>
+        <w:t xml:space="preserve">data. </w:t>
       </w:r>
     </w:p>
     <w:p>
@@ -901,52 +985,89 @@
       </w:r>
     </w:p>
     <w:p>
-      <w:r>
-        <w:t xml:space="preserve">The primary investigator wants to explore whether </w:t>
-      </w:r>
-      <w:r>
-        <w:t>students from groups labelled as URM experience inequities in the</w:t>
-      </w:r>
-      <w:r>
-        <w:t xml:space="preserve"> assessment of their clinical skills. The primary research question is “Are there differences in the clinical skills assessment scores received between URM and non-URM students at the School of Medicine?” </w:t>
-      </w:r>
-      <w:r>
+      <w:pPr>
         <w:rPr>
           <w:b/>
           <w:bCs/>
         </w:rPr>
-        <w:t xml:space="preserve">The clinical hypothesis is that there will be differences in OSCE scores between URM and non-URM students. </w:t>
-      </w:r>
-    </w:p>
-    <w:p>
-      <w:r>
-        <w:t>The</w:t>
-      </w:r>
-      <w:r>
-        <w:t xml:space="preserve"> minimum intended product is a poster for a local presentation at a conference for Medical Educators. Eventually, this work is expected </w:t>
-      </w:r>
-      <w:r>
-        <w:t>to be included in a manuscript in a health professions education journal, such as Medical Education or Academic Medicine.</w:t>
-      </w:r>
-      <w:r>
-        <w:t xml:space="preserve"> </w:t>
-      </w:r>
-    </w:p>
-    <w:p>
-      <w:pPr>
-        <w:pStyle w:val="Heading3"/>
-      </w:pPr>
-      <w:r>
-        <w:t>Draft Analysis Plan</w:t>
-      </w:r>
-    </w:p>
-    <w:p>
+      </w:pPr>
+      <w:r>
+        <w:t xml:space="preserve">The primary investigator wants to explore whether </w:t>
+      </w:r>
+      <w:r>
+        <w:t>students from groups labelled as URM experience inequities in the</w:t>
+      </w:r>
+      <w:r>
+        <w:t xml:space="preserve"> assessment of their clinical skills. The primary research question is “Are there differences in the clinical skills assessment scores received between URM and non-URM students at the School of Medicine</w:t>
+      </w:r>
+      <w:r>
+        <w:t xml:space="preserve">?” </w:t>
+      </w:r>
+      <w:r>
+        <w:t>The clinical hypothesis is that there will be differences in OSCE scores between URM and non-URM students.</w:t>
+      </w:r>
       <w:r>
         <w:rPr>
           <w:b/>
           <w:bCs/>
         </w:rPr>
-        <w:t xml:space="preserve">The statistical hypothesis is that the median OSCE scores for URM students will differ significantly </w:t>
+        <w:t xml:space="preserve"> </w:t>
+      </w:r>
+    </w:p>
+    <w:p>
+      <w:r>
+        <w:t>The null statistical hypothesis is that the m</w:t>
+      </w:r>
+      <w:r>
+        <w:t xml:space="preserve">edian of the mean OSCE scores will be the same for both URM and non-URM students. The alternative statistical hypothesis </w:t>
+      </w:r>
+      <w:r>
+        <w:t>is that the median of the mean OSCE scores will differ between URM and non-URM students.</w:t>
+      </w:r>
+    </w:p>
+    <w:p>
+      <w:r>
+        <w:t>The</w:t>
+      </w:r>
+      <w:r>
+        <w:t xml:space="preserve"> minimum intended product is a poster for a local presentation at a conference for Medical Educators. Eventually, this work is expected </w:t>
+      </w:r>
+      <w:r>
+        <w:t>to be included in a manuscript in a health professions education journal, such as Medical Education or Academic Medicine.</w:t>
+      </w:r>
+      <w:r>
+        <w:t xml:space="preserve"> </w:t>
+      </w:r>
+    </w:p>
+    <w:p>
+      <w:pPr>
+        <w:pStyle w:val="Heading3"/>
+      </w:pPr>
+      <w:r>
+        <w:t>Draft Analysis Plan</w:t>
+      </w:r>
+    </w:p>
+    <w:p>
+      <w:r>
+        <w:rPr>
+          <w:b/>
+          <w:bCs/>
+        </w:rPr>
+        <w:t xml:space="preserve">The statistical hypothesis is that the median </w:t>
+      </w:r>
+      <w:r>
+        <w:rPr>
+          <w:b/>
+          <w:bCs/>
+        </w:rPr>
+        <w:t xml:space="preserve">of the mean </w:t>
+      </w:r>
+      <w:r>
+        <w:rPr>
+          <w:b/>
+          <w:bCs/>
+        </w:rPr>
+        <w:t xml:space="preserve">OSCE scores for URM students will differ significantly </w:t>
       </w:r>
       <w:r>
         <w:rPr>
@@ -964,2610 +1085,81 @@
       <w:r>
         <w:t xml:space="preserve">reflection and transformation, or non-parametric tests will be required. </w:t>
       </w:r>
-      <w:r>
-        <w:t xml:space="preserve">This is a draft analysis plan, subject to revision and adjustment after data exploration and cleaning. </w:t>
-      </w:r>
     </w:p>
     <w:p>
       <w:r>
-        <w:t xml:space="preserve">First, we will create three constructed OSCE variables: </w:t>
-      </w:r>
-      <w:r>
-        <w:t>CommScore, PhysExamScore, and MedDocScore</w:t>
-      </w:r>
-      <w:r>
-        <w:t xml:space="preserve">, which will be the </w:t>
-      </w:r>
-      <w:r>
-        <w:t xml:space="preserve">mean </w:t>
-      </w:r>
-      <w:r>
-        <w:t xml:space="preserve">of the Bates, Ramos, Payne, Hyde and Snelling </w:t>
-      </w:r>
-      <w:r>
-        <w:t>scores for each component.</w:t>
-      </w:r>
-      <w:r>
-        <w:t xml:space="preserve"> Using the mean value</w:t>
-      </w:r>
-      <w:r>
-        <w:t xml:space="preserve"> allows us to better account for missing components</w:t>
-      </w:r>
-      <w:r>
-        <w:t xml:space="preserve">, as </w:t>
-      </w:r>
-      <w:r>
-        <w:t xml:space="preserve">the data </w:t>
-      </w:r>
-      <w:r>
-        <w:t>includes</w:t>
-      </w:r>
-      <w:r>
-        <w:t xml:space="preserve"> approximately 40 missing values for each OSCE score. </w:t>
+        <w:t>As these are exploratory analyses</w:t>
+      </w:r>
+      <w:r>
+        <w:t xml:space="preserve"> and the outcome variable does not meet normality assumptions, we will use a Wilcoxon </w:t>
+      </w:r>
+      <w:r>
+        <w:t>Rank-Sum Test</w:t>
+      </w:r>
+      <w:r>
+        <w:t xml:space="preserve"> (</w:t>
+      </w:r>
+      <w:r>
+        <w:t>Mann-Whitney U Test</w:t>
+      </w:r>
+      <w:r>
+        <w:t>)</w:t>
+      </w:r>
+      <w:r>
+        <w:t xml:space="preserve"> to compare m</w:t>
+      </w:r>
+      <w:r>
+        <w:t>edian</w:t>
+      </w:r>
+      <w:r>
+        <w:t xml:space="preserve"> </w:t>
+      </w:r>
+      <w:proofErr w:type="spellStart"/>
+      <w:r>
+        <w:t>CommScores</w:t>
+      </w:r>
+      <w:proofErr w:type="spellEnd"/>
+      <w:r>
+        <w:t xml:space="preserve">, </w:t>
+      </w:r>
+      <w:proofErr w:type="spellStart"/>
+      <w:r>
+        <w:t>PhysExamScores</w:t>
+      </w:r>
+      <w:proofErr w:type="spellEnd"/>
+      <w:r>
+        <w:t xml:space="preserve"> and </w:t>
+      </w:r>
+      <w:proofErr w:type="spellStart"/>
+      <w:r>
+        <w:t>MedDocScores</w:t>
+      </w:r>
+      <w:proofErr w:type="spellEnd"/>
+      <w:r>
+        <w:t xml:space="preserve"> between URM students and non-URM students.</w:t>
+      </w:r>
+      <w:r>
+        <w:t xml:space="preserve"> </w:t>
+      </w:r>
+      <w:r>
+        <w:t xml:space="preserve">Given the connected nature of the three OSCE score components, we will use a </w:t>
+      </w:r>
+      <w:r>
+        <w:t>Bonferroni</w:t>
+      </w:r>
+      <w:r>
+        <w:t xml:space="preserve"> correction to account for the repeated testing. </w:t>
       </w:r>
     </w:p>
     <w:p>
       <w:r>
-        <w:t>As these are exploratory analyses</w:t>
-      </w:r>
-      <w:r>
-        <w:t xml:space="preserve"> and the outcome variable does not meet normality assumptions, we will use a Wilcoxon </w:t>
-      </w:r>
-      <w:r>
-        <w:t>Rank-Sum Test to compare mean CommScores, PhysExamScores and MedDocScores between URM students and non-URM students.</w:t>
-      </w:r>
-      <w:r>
-        <w:t xml:space="preserve"> </w:t>
-      </w:r>
-      <w:r>
-        <w:t xml:space="preserve">Given the connected nature of the three OSCE score components, we will use a Boneferonni correction to </w:t>
-      </w:r>
-      <w:r>
-        <w:t>account</w:t>
-      </w:r>
-      <w:r>
-        <w:t xml:space="preserve"> for the repeated testing. </w:t>
-      </w:r>
-    </w:p>
-    <w:p>
-      <w:r>
+        <w:lastRenderedPageBreak/>
         <w:t xml:space="preserve">As a secondary analysis, we will conduct Wilcoxon Rank-Sum tests to compare OSCE scores between male and female students. </w:t>
       </w:r>
-    </w:p>
-    <w:p>
-      <w:pPr>
-        <w:rPr>
-          <w:rFonts w:cs="Arial"/>
-          <w:highlight w:val="yellow"/>
-        </w:rPr>
-      </w:pPr>
-    </w:p>
-    <w:p>
-      <w:pPr>
-        <w:pStyle w:val="Heading2"/>
-        <w:rPr>
-          <w:rFonts w:asciiTheme="minorHAnsi" w:hAnsiTheme="minorHAnsi" w:cs="Arial"/>
-          <w:sz w:val="28"/>
-        </w:rPr>
-      </w:pPr>
-      <w:commentRangeStart w:id="0"/>
-      <w:r>
-        <w:rPr>
-          <w:rFonts w:asciiTheme="minorHAnsi" w:hAnsiTheme="minorHAnsi" w:cs="Arial"/>
-          <w:sz w:val="28"/>
-        </w:rPr>
-        <w:t>Project Deliverables</w:t>
-      </w:r>
-      <w:commentRangeEnd w:id="0"/>
-      <w:r>
-        <w:rPr>
-          <w:rStyle w:val="CommentReference"/>
-          <w:rFonts w:asciiTheme="minorHAnsi" w:hAnsiTheme="minorHAnsi" w:cs="Arial"/>
-          <w:sz w:val="28"/>
-          <w:szCs w:val="26"/>
-        </w:rPr>
-        <w:commentReference w:id="0"/>
-      </w:r>
-    </w:p>
-    <w:p>
-      <w:pPr>
-        <w:pStyle w:val="ListParagraph"/>
-        <w:numPr>
-          <w:ilvl w:val="0"/>
-          <w:numId w:val="7"/>
-        </w:numPr>
-        <w:spacing w:before="120" w:after="120"/>
-        <w:ind w:left="360"/>
-        <w:contextualSpacing w:val="0"/>
-        <w:rPr>
-          <w:rFonts w:cs="Arial"/>
-          <w:sz w:val="20"/>
-          <w:szCs w:val="20"/>
-        </w:rPr>
-      </w:pPr>
-      <w:r>
-        <w:rPr>
-          <w:rFonts w:cs="Arial"/>
-          <w:b/>
-        </w:rPr>
-        <w:t>Exploratory Analysis Report</w:t>
-      </w:r>
-      <w:r>
-        <w:rPr>
-          <w:rFonts w:cs="Arial"/>
-        </w:rPr>
-        <w:br/>
-      </w:r>
-      <w:r>
-        <w:rPr>
-          <w:rFonts w:cs="Arial"/>
-          <w:sz w:val="20"/>
-          <w:szCs w:val="20"/>
-        </w:rPr>
-        <w:t xml:space="preserve">Following the project kickoff meeting, the CIDA analyst(s) will establish a draft analysis plan, create preliminary analysis dataset, create 1-2 descriptive statistics tables (Table 1 type tables in AMA format), produce graphics where applicable (up to 4), conduct </w:t>
-      </w:r>
-      <w:r>
-        <w:rPr>
-          <w:rFonts w:cs="Arial"/>
-          <w:sz w:val="20"/>
-          <w:szCs w:val="20"/>
-        </w:rPr>
-        <w:lastRenderedPageBreak/>
-        <w:t>exploratory analyses (e.g. run univariate models), and create 1-2 tables describing results. The Exploratory Analysis Report includes a brief section on the data (e.g. defining any variables for creation, subjects excluded and why, and other data manipulations needed for the analysis dataset), a draft analysis plan, and results of this preliminary analyses including the Tables and Figures. We require an in-person or zoom meeting to discuss these results and finalize the analysis plan.</w:t>
-      </w:r>
-    </w:p>
-    <w:p>
-      <w:pPr>
-        <w:pStyle w:val="ListParagraph"/>
-        <w:numPr>
-          <w:ilvl w:val="0"/>
-          <w:numId w:val="7"/>
-        </w:numPr>
-        <w:spacing w:before="120" w:after="120"/>
-        <w:ind w:left="360"/>
-        <w:contextualSpacing w:val="0"/>
-        <w:rPr>
-          <w:rFonts w:cs="Arial"/>
-          <w:sz w:val="20"/>
-          <w:szCs w:val="20"/>
-        </w:rPr>
-      </w:pPr>
-      <w:r>
-        <w:rPr>
-          <w:rFonts w:cs="Arial"/>
-          <w:b/>
-        </w:rPr>
-        <w:t xml:space="preserve">Comprehensive Analysis Report </w:t>
-      </w:r>
-      <w:r>
-        <w:rPr>
-          <w:rFonts w:cs="Arial"/>
-          <w:b/>
-        </w:rPr>
-        <w:br/>
-      </w:r>
-      <w:r>
-        <w:rPr>
-          <w:rFonts w:cs="Arial"/>
-          <w:sz w:val="20"/>
-          <w:szCs w:val="20"/>
-        </w:rPr>
-        <w:t>A final analysis dataset will be updated per any changes discussed during review of the exploratory report, and descriptive tables will be updated accordingly.  Comprehensive analysis will be conducted according to the finalized analysis plan, and the CIDA analyst(s) will populate the 1-2 results tables, create up to 4 near publication quality graphs and update the analysis report. The Comprehensive Analysis Report includes an introduction, brief section on data, statistical methods section, and results section including Tables and Figures. We require an in-person or zoom meeting to discuss these results.</w:t>
-      </w:r>
-    </w:p>
-    <w:p>
-      <w:pPr>
-        <w:pStyle w:val="ListParagraph"/>
-        <w:numPr>
-          <w:ilvl w:val="0"/>
-          <w:numId w:val="7"/>
-        </w:numPr>
-        <w:spacing w:before="120" w:after="120"/>
-        <w:ind w:left="360"/>
-        <w:contextualSpacing w:val="0"/>
-        <w:rPr>
-          <w:rFonts w:cs="Arial"/>
-          <w:b/>
-        </w:rPr>
-      </w:pPr>
-      <w:r>
-        <w:rPr>
-          <w:rFonts w:cs="Arial"/>
-          <w:b/>
-        </w:rPr>
-        <w:t>Comprehensive Analysis Report Revisions</w:t>
-      </w:r>
-      <w:r>
-        <w:rPr>
-          <w:rFonts w:cs="Arial"/>
-          <w:b/>
-        </w:rPr>
-        <w:br/>
-      </w:r>
-      <w:r>
-        <w:rPr>
-          <w:rFonts w:cs="Arial"/>
-          <w:sz w:val="20"/>
-          <w:szCs w:val="20"/>
-        </w:rPr>
-        <w:t>The CIDA analyst(s) will provide one update to the Comprehensive Analysis Report as needed to address points of clarification and small additional questions; these updates will be discussed during the review of the Comprehensive Analysis Report.  Please note that additional hypothesis testing beyond the agreed upon scope of work may result in additional charges.</w:t>
-      </w:r>
-    </w:p>
-    <w:p>
-      <w:pPr>
-        <w:pStyle w:val="ListParagraph"/>
-        <w:numPr>
-          <w:ilvl w:val="0"/>
-          <w:numId w:val="7"/>
-        </w:numPr>
-        <w:spacing w:before="120" w:after="0"/>
-        <w:ind w:left="360"/>
-        <w:contextualSpacing w:val="0"/>
-        <w:rPr>
-          <w:rFonts w:cs="Arial"/>
-          <w:sz w:val="20"/>
-        </w:rPr>
-      </w:pPr>
-      <w:r>
-        <w:rPr>
-          <w:rFonts w:cs="Arial"/>
-          <w:b/>
-        </w:rPr>
-        <w:t xml:space="preserve">Manuscript </w:t>
-      </w:r>
-      <w:r>
-        <w:rPr>
-          <w:rFonts w:cs="Arial"/>
-          <w:b/>
-        </w:rPr>
-        <w:t>Editing</w:t>
-      </w:r>
-    </w:p>
-    <w:p>
-      <w:pPr>
-        <w:pStyle w:val="ListParagraph"/>
-        <w:spacing w:after="120"/>
-        <w:ind w:left="360"/>
-        <w:contextualSpacing w:val="0"/>
-        <w:rPr>
-          <w:rFonts w:cs="Arial"/>
-          <w:sz w:val="20"/>
-          <w:szCs w:val="20"/>
-        </w:rPr>
-      </w:pPr>
-      <w:r>
-        <w:rPr>
-          <w:rFonts w:cs="Arial"/>
-          <w:sz w:val="20"/>
-        </w:rPr>
-        <w:t xml:space="preserve">The CIDA analyst(s) will provide edits to manuscript draft, to including a review of the manuscript for overall content and clarity, appropriately editing the statistical methods and results sections from the Comprehensive Analysis Report, and up to two updates of the figures / tables </w:t>
-      </w:r>
-      <w:r>
-        <w:rPr>
-          <w:rFonts w:cs="Arial"/>
-          <w:sz w:val="20"/>
-        </w:rPr>
-        <w:t xml:space="preserve">per journal requirements for the submission.  </w:t>
-      </w:r>
-      <w:r>
-        <w:rPr>
-          <w:rFonts w:cs="Arial"/>
-          <w:sz w:val="20"/>
-        </w:rPr>
-        <w:t xml:space="preserve">Please note that </w:t>
-      </w:r>
-      <w:r>
-        <w:rPr>
-          <w:rFonts w:cs="Arial"/>
-          <w:b/>
-          <w:sz w:val="20"/>
-          <w:u w:val="single"/>
-        </w:rPr>
-        <w:t xml:space="preserve">the manuscript draft </w:t>
-      </w:r>
-      <w:r>
-        <w:rPr>
-          <w:rFonts w:cs="Arial"/>
-          <w:b/>
-          <w:sz w:val="20"/>
-          <w:u w:val="single"/>
-        </w:rPr>
-        <w:t>should</w:t>
-      </w:r>
-      <w:r>
-        <w:rPr>
-          <w:rFonts w:cs="Arial"/>
-          <w:b/>
-          <w:sz w:val="20"/>
-          <w:u w:val="single"/>
-        </w:rPr>
-        <w:t xml:space="preserve"> be provided to the biostatistician within </w:t>
-      </w:r>
-      <w:r>
-        <w:rPr>
-          <w:rFonts w:cs="Arial"/>
-          <w:b/>
-          <w:sz w:val="20"/>
-          <w:u w:val="single"/>
-        </w:rPr>
-        <w:t>90 days</w:t>
-      </w:r>
-      <w:r>
-        <w:rPr>
-          <w:rFonts w:cs="Arial"/>
-          <w:b/>
-          <w:sz w:val="20"/>
-          <w:u w:val="single"/>
-        </w:rPr>
-        <w:t xml:space="preserve"> after receipt of the Comprehensive Analysis Report revisions</w:t>
-      </w:r>
-      <w:r>
-        <w:rPr>
-          <w:rFonts w:cs="Arial"/>
-          <w:b/>
-          <w:sz w:val="20"/>
-          <w:u w:val="single"/>
-        </w:rPr>
-        <w:t xml:space="preserve"> unless otherwise agreed upon</w:t>
-      </w:r>
-      <w:r>
-        <w:rPr>
-          <w:rFonts w:cs="Arial"/>
-          <w:sz w:val="20"/>
-        </w:rPr>
-        <w:t>.</w:t>
-      </w:r>
-      <w:r>
-        <w:rPr>
-          <w:rFonts w:cs="Arial"/>
-          <w:sz w:val="20"/>
-        </w:rPr>
-        <w:t xml:space="preserve">  </w:t>
-      </w:r>
-      <w:r>
-        <w:rPr>
-          <w:rFonts w:cs="Arial"/>
-          <w:sz w:val="20"/>
-        </w:rPr>
-        <w:t xml:space="preserve">Manuscripts submitted for editing after </w:t>
-      </w:r>
-      <w:r>
-        <w:rPr>
-          <w:rFonts w:cs="Arial"/>
-          <w:sz w:val="20"/>
-        </w:rPr>
-        <w:t>90 days</w:t>
-      </w:r>
-      <w:r>
-        <w:rPr>
-          <w:rFonts w:cs="Arial"/>
-          <w:sz w:val="20"/>
-        </w:rPr>
-        <w:t xml:space="preserve"> of receipt of the Comprehensive Analysis Report revisions may be subject to additional charges.</w:t>
-      </w:r>
-      <w:r>
-        <w:rPr>
-          <w:rFonts w:cs="Arial"/>
-          <w:sz w:val="20"/>
-        </w:rPr>
-        <w:t xml:space="preserve">  </w:t>
-      </w:r>
-      <w:r>
-        <w:rPr>
-          <w:rFonts w:cs="Arial"/>
-          <w:sz w:val="20"/>
-        </w:rPr>
-        <w:t>CIDA will provide reasonable edits and draft responses to address reviewer questions and comments; however, additional work, including additional analyses requested by reviewers, may result in additional charges.</w:t>
-      </w:r>
-    </w:p>
-    <w:p>
-      <w:pPr>
-        <w:pStyle w:val="Heading2"/>
-        <w:rPr>
-          <w:rFonts w:asciiTheme="minorHAnsi" w:hAnsiTheme="minorHAnsi" w:cs="Arial"/>
-          <w:sz w:val="28"/>
-        </w:rPr>
-      </w:pPr>
-      <w:commentRangeStart w:id="1"/>
-      <w:r>
-        <w:rPr>
-          <w:rFonts w:asciiTheme="minorHAnsi" w:hAnsiTheme="minorHAnsi" w:cs="Arial"/>
-          <w:sz w:val="28"/>
-        </w:rPr>
-        <w:t>Investigator Responsibilities</w:t>
-      </w:r>
-      <w:commentRangeEnd w:id="1"/>
-      <w:r>
-        <w:rPr>
-          <w:rStyle w:val="CommentReference"/>
-          <w:rFonts w:asciiTheme="minorHAnsi" w:hAnsiTheme="minorHAnsi" w:cs="Arial"/>
-          <w:sz w:val="28"/>
-          <w:szCs w:val="26"/>
-        </w:rPr>
-        <w:commentReference w:id="1"/>
-      </w:r>
-    </w:p>
-    <w:p>
-      <w:pPr>
-        <w:pStyle w:val="Heading3"/>
-        <w:numPr>
-          <w:ilvl w:val="0"/>
-          <w:numId w:val="3"/>
-        </w:numPr>
-        <w:spacing w:before="0" w:after="120" w:line="240" w:lineRule="auto"/>
-        <w:rPr>
-          <w:rFonts w:asciiTheme="minorHAnsi" w:hAnsiTheme="minorHAnsi" w:cs="Arial"/>
-          <w:color w:val="auto"/>
-          <w:sz w:val="22"/>
-          <w:szCs w:val="22"/>
-        </w:rPr>
-      </w:pPr>
-      <w:commentRangeStart w:id="2"/>
-      <w:r>
-        <w:rPr>
-          <w:rFonts w:asciiTheme="minorHAnsi" w:hAnsiTheme="minorHAnsi" w:cs="Arial"/>
-          <w:color w:val="auto"/>
-          <w:sz w:val="22"/>
-          <w:szCs w:val="22"/>
-        </w:rPr>
-        <w:t xml:space="preserve">Provide </w:t>
-      </w:r>
-      <w:r>
-        <w:rPr>
-          <w:rFonts w:asciiTheme="minorHAnsi" w:hAnsiTheme="minorHAnsi" w:cs="Arial"/>
-          <w:color w:val="auto"/>
-          <w:sz w:val="22"/>
-          <w:szCs w:val="22"/>
-        </w:rPr>
-        <w:t>cleaned data</w:t>
-      </w:r>
-      <w:r>
-        <w:rPr>
-          <w:rFonts w:asciiTheme="minorHAnsi" w:hAnsiTheme="minorHAnsi" w:cs="Arial"/>
-          <w:color w:val="auto"/>
-          <w:sz w:val="22"/>
-          <w:szCs w:val="22"/>
-        </w:rPr>
-        <w:t xml:space="preserve">:  </w:t>
-      </w:r>
-      <w:r>
-        <w:rPr>
-          <w:rFonts w:asciiTheme="minorHAnsi" w:hAnsiTheme="minorHAnsi" w:cs="Arial"/>
-          <w:b w:val="0"/>
-          <w:color w:val="auto"/>
-          <w:sz w:val="22"/>
-          <w:szCs w:val="22"/>
-        </w:rPr>
-        <w:t xml:space="preserve">Unless data management is stipulated in the deliverables above, the data are assumed to be cleaned and ready for analysis. </w:t>
-      </w:r>
-      <w:r>
-        <w:rPr>
-          <w:rFonts w:asciiTheme="minorHAnsi" w:hAnsiTheme="minorHAnsi" w:cs="Arial"/>
-          <w:b w:val="0"/>
-          <w:color w:val="auto"/>
-          <w:sz w:val="22"/>
-          <w:szCs w:val="22"/>
-        </w:rPr>
-        <w:t xml:space="preserve">Please see our data format guidelines </w:t>
-      </w:r>
-      <w:r>
-        <w:rPr>
-          <w:rFonts w:asciiTheme="minorHAnsi" w:hAnsiTheme="minorHAnsi" w:cs="Arial"/>
-          <w:b w:val="0"/>
-          <w:sz w:val="22"/>
-          <w:szCs w:val="22"/>
-        </w:rPr>
-        <w:t>(</w:t>
-      </w:r>
-      <w:hyperlink r:id="rId16" w:anchor="ac-dataset-format-guidelines-2" w:history="1">
-        <w:r>
-          <w:rPr>
-            <w:rStyle w:val="Hyperlink"/>
-            <w:rFonts w:asciiTheme="minorHAnsi" w:hAnsiTheme="minorHAnsi" w:cs="Arial"/>
-            <w:b w:val="0"/>
-            <w:sz w:val="22"/>
-            <w:szCs w:val="22"/>
-          </w:rPr>
-          <w:t>Data Format Guidelines</w:t>
-        </w:r>
-      </w:hyperlink>
-      <w:r>
-        <w:rPr>
-          <w:rFonts w:asciiTheme="minorHAnsi" w:hAnsiTheme="minorHAnsi" w:cs="Arial"/>
-          <w:b w:val="0"/>
-          <w:sz w:val="22"/>
-          <w:szCs w:val="22"/>
-        </w:rPr>
-        <w:t xml:space="preserve">) </w:t>
-      </w:r>
-      <w:r>
-        <w:rPr>
-          <w:rFonts w:asciiTheme="minorHAnsi" w:hAnsiTheme="minorHAnsi" w:cs="Arial"/>
-          <w:b w:val="0"/>
-          <w:color w:val="auto"/>
-          <w:sz w:val="22"/>
-          <w:szCs w:val="22"/>
-        </w:rPr>
-        <w:t>for assistance if desired.</w:t>
-      </w:r>
-      <w:commentRangeEnd w:id="2"/>
-      <w:r>
-        <w:rPr>
-          <w:rStyle w:val="CommentReference"/>
-          <w:rFonts w:asciiTheme="minorHAnsi" w:hAnsiTheme="minorHAnsi" w:cs="Arial"/>
-          <w:b w:val="0"/>
-          <w:color w:val="auto"/>
-          <w:sz w:val="22"/>
-          <w:szCs w:val="22"/>
-        </w:rPr>
-        <w:commentReference w:id="2"/>
-      </w:r>
-      <w:r>
-        <w:rPr>
-          <w:rFonts w:asciiTheme="minorHAnsi" w:hAnsiTheme="minorHAnsi" w:cs="Arial"/>
-          <w:b w:val="0"/>
-          <w:color w:val="auto"/>
-          <w:sz w:val="22"/>
-          <w:szCs w:val="22"/>
-        </w:rPr>
-        <w:t xml:space="preserve"> </w:t>
-      </w:r>
-      <w:r>
-        <w:rPr>
-          <w:rFonts w:asciiTheme="minorHAnsi" w:hAnsiTheme="minorHAnsi" w:cs="Arial"/>
-          <w:b w:val="0"/>
-          <w:color w:val="auto"/>
-          <w:sz w:val="22"/>
-          <w:szCs w:val="22"/>
-        </w:rPr>
-        <w:t xml:space="preserve">Datasets that do not comply with the formatting guidelines will </w:t>
-      </w:r>
-      <w:r>
-        <w:rPr>
-          <w:rFonts w:asciiTheme="minorHAnsi" w:hAnsiTheme="minorHAnsi" w:cs="Arial"/>
-          <w:b w:val="0"/>
-          <w:color w:val="auto"/>
-          <w:sz w:val="22"/>
-          <w:szCs w:val="22"/>
-        </w:rPr>
-        <w:t>either be returned to the investigator or</w:t>
-      </w:r>
-      <w:r>
-        <w:rPr>
-          <w:rFonts w:asciiTheme="minorHAnsi" w:hAnsiTheme="minorHAnsi" w:cs="Arial"/>
-          <w:b w:val="0"/>
-          <w:color w:val="auto"/>
-          <w:sz w:val="22"/>
-          <w:szCs w:val="22"/>
-        </w:rPr>
-        <w:t xml:space="preserve"> subject to additional fees for </w:t>
-      </w:r>
-      <w:r>
-        <w:rPr>
-          <w:rFonts w:asciiTheme="minorHAnsi" w:hAnsiTheme="minorHAnsi" w:cs="Arial"/>
-          <w:b w:val="0"/>
-          <w:color w:val="auto"/>
-          <w:sz w:val="22"/>
-          <w:szCs w:val="22"/>
-        </w:rPr>
-        <w:t>data management.</w:t>
-      </w:r>
-    </w:p>
-    <w:p>
-      <w:pPr>
-        <w:pStyle w:val="ListParagraph"/>
-        <w:numPr>
-          <w:ilvl w:val="0"/>
-          <w:numId w:val="3"/>
-        </w:numPr>
-        <w:spacing w:after="120" w:line="240" w:lineRule="auto"/>
-        <w:contextualSpacing w:val="0"/>
-        <w:rPr>
-          <w:rFonts w:cs="Arial"/>
-        </w:rPr>
-      </w:pPr>
-      <w:r>
-        <w:rPr>
-          <w:rFonts w:cs="Arial"/>
-          <w:b/>
-        </w:rPr>
-        <w:t>Remove any protected health information (PHI) or similar identifie</w:t>
-      </w:r>
-      <w:r>
-        <w:rPr>
-          <w:rFonts w:cs="Arial"/>
-          <w:b/>
-        </w:rPr>
-        <w:t>r</w:t>
-      </w:r>
-      <w:r>
-        <w:rPr>
-          <w:rFonts w:cs="Arial"/>
-          <w:b/>
-        </w:rPr>
-        <w:t>s</w:t>
-      </w:r>
-      <w:r>
-        <w:rPr>
-          <w:rFonts w:cs="Arial"/>
-        </w:rPr>
-        <w:t xml:space="preserve"> from data that are not required for analysis, creating unique identifie</w:t>
-      </w:r>
-      <w:r>
-        <w:rPr>
-          <w:rFonts w:cs="Arial"/>
-        </w:rPr>
-        <w:t>rs instead (e.g. MRN numbers).</w:t>
-      </w:r>
-    </w:p>
-    <w:p>
-      <w:pPr>
-        <w:pStyle w:val="ListParagraph"/>
-        <w:numPr>
-          <w:ilvl w:val="0"/>
-          <w:numId w:val="3"/>
-        </w:numPr>
-        <w:spacing w:after="120" w:line="240" w:lineRule="auto"/>
-        <w:contextualSpacing w:val="0"/>
-        <w:rPr>
-          <w:rFonts w:cs="Arial"/>
-        </w:rPr>
-      </w:pPr>
-      <w:r>
-        <w:rPr>
-          <w:rFonts w:cs="Arial"/>
-          <w:b/>
-        </w:rPr>
-        <w:t>Be responsive</w:t>
-      </w:r>
-      <w:r>
-        <w:rPr>
-          <w:rFonts w:cs="Arial"/>
-        </w:rPr>
-        <w:t xml:space="preserve"> in email (1 working day) and be available for meetings</w:t>
-      </w:r>
-      <w:r>
-        <w:rPr>
-          <w:rFonts w:cs="Arial"/>
-        </w:rPr>
-        <w:t xml:space="preserve"> during standard working hours throughout</w:t>
-      </w:r>
-      <w:r>
-        <w:rPr>
-          <w:rFonts w:cs="Arial"/>
-        </w:rPr>
-        <w:t xml:space="preserve"> the project period.</w:t>
-      </w:r>
-    </w:p>
-    <w:p>
-      <w:pPr>
-        <w:pStyle w:val="ListParagraph"/>
-        <w:numPr>
-          <w:ilvl w:val="0"/>
-          <w:numId w:val="3"/>
-        </w:numPr>
-        <w:spacing w:after="120" w:line="240" w:lineRule="auto"/>
-        <w:contextualSpacing w:val="0"/>
-        <w:rPr>
-          <w:rFonts w:cs="Arial"/>
-        </w:rPr>
-      </w:pPr>
-      <w:r>
-        <w:rPr>
-          <w:rFonts w:cs="Arial"/>
-          <w:b/>
-        </w:rPr>
-        <w:t>Cite the CCTSI grant</w:t>
-      </w:r>
-      <w:r>
-        <w:rPr>
-          <w:rFonts w:cs="Arial"/>
-          <w:b/>
-        </w:rPr>
-        <w:t xml:space="preserve"> in any publication </w:t>
-      </w:r>
-      <w:r>
-        <w:rPr>
-          <w:rFonts w:cs="Arial"/>
-        </w:rPr>
-        <w:t>prepared with CIDA support and register your publication with PubMed Central. Example text can be found here</w:t>
-      </w:r>
-      <w:r>
-        <w:rPr>
-          <w:rFonts w:cs="Arial"/>
-        </w:rPr>
-        <w:t xml:space="preserve">: </w:t>
-      </w:r>
-      <w:hyperlink r:id="rId17" w:history="1">
-        <w:r>
-          <w:rPr>
-            <w:rStyle w:val="Hyperlink"/>
-            <w:rFonts w:cs="Arial"/>
-          </w:rPr>
-          <w:t>CCTSI Citation</w:t>
-        </w:r>
-      </w:hyperlink>
-      <w:r>
-        <w:rPr>
-          <w:rFonts w:cs="Arial"/>
-        </w:rPr>
-        <w:t xml:space="preserve"> </w:t>
-      </w:r>
-      <w:r>
-        <w:rPr>
-          <w:rFonts w:cs="Arial"/>
-        </w:rPr>
-        <w:t>.</w:t>
-      </w:r>
-    </w:p>
-    <w:p>
-      <w:pPr>
-        <w:pStyle w:val="ListParagraph"/>
-        <w:numPr>
-          <w:ilvl w:val="0"/>
-          <w:numId w:val="3"/>
-        </w:numPr>
-        <w:spacing w:after="120" w:line="240" w:lineRule="auto"/>
-        <w:contextualSpacing w:val="0"/>
-        <w:rPr>
-          <w:rFonts w:cs="Arial"/>
-        </w:rPr>
-      </w:pPr>
-      <w:r>
-        <w:rPr>
-          <w:rFonts w:cs="Arial"/>
-          <w:b/>
-        </w:rPr>
-        <w:t>Include the analyst(s) as co-authors</w:t>
-      </w:r>
-      <w:r>
-        <w:rPr>
-          <w:rFonts w:cs="Arial"/>
-        </w:rPr>
-        <w:t xml:space="preserve"> where the analytic component of the project meets authorship </w:t>
-      </w:r>
-      <w:r>
-        <w:rPr>
-          <w:rFonts w:cs="Arial"/>
-        </w:rPr>
-        <w:t>guidel</w:t>
-      </w:r>
-      <w:r>
-        <w:rPr>
-          <w:rFonts w:cs="Arial"/>
-        </w:rPr>
-        <w:t>i</w:t>
-      </w:r>
-      <w:r>
-        <w:rPr>
-          <w:rFonts w:cs="Arial"/>
-        </w:rPr>
-        <w:t>nes</w:t>
-      </w:r>
-      <w:r>
-        <w:rPr>
-          <w:rFonts w:cs="Arial"/>
-        </w:rPr>
-        <w:t>.</w:t>
-      </w:r>
-      <w:r>
-        <w:rPr>
-          <w:rFonts w:cs="Arial"/>
-        </w:rPr>
-        <w:t xml:space="preserve"> The CIDA abides by the </w:t>
-      </w:r>
-      <w:hyperlink r:id="rId18" w:history="1">
-        <w:r>
-          <w:rPr>
-            <w:rStyle w:val="Hyperlink"/>
-            <w:rFonts w:cs="Arial"/>
-          </w:rPr>
-          <w:t>International Committee of Medical Journal Editors (ICMJE) guidelines concerning authorship</w:t>
-        </w:r>
-      </w:hyperlink>
-      <w:r>
-        <w:rPr>
-          <w:rFonts w:cs="Arial"/>
-        </w:rPr>
-        <w:t xml:space="preserve">. Visit our CIDA website to learn more about </w:t>
-      </w:r>
-      <w:hyperlink r:id="rId19" w:anchor="ac-authorship-0" w:history="1">
-        <w:r>
-          <w:rPr>
-            <w:rStyle w:val="Hyperlink"/>
-            <w:rFonts w:cs="Arial"/>
-          </w:rPr>
-          <w:t>CIDA’s authorship policies</w:t>
-        </w:r>
-      </w:hyperlink>
-      <w:r>
-        <w:rPr>
-          <w:rFonts w:cs="Arial"/>
-        </w:rPr>
-        <w:t>.</w:t>
-      </w:r>
-    </w:p>
-    <w:p>
-      <w:pPr>
-        <w:pStyle w:val="ListParagraph"/>
-        <w:numPr>
-          <w:ilvl w:val="0"/>
-          <w:numId w:val="3"/>
-        </w:numPr>
-        <w:spacing w:after="120" w:line="240" w:lineRule="auto"/>
-        <w:contextualSpacing w:val="0"/>
-        <w:rPr>
-          <w:rFonts w:cs="Arial"/>
-        </w:rPr>
-      </w:pPr>
-      <w:commentRangeStart w:id="3"/>
-      <w:r>
-        <w:rPr>
-          <w:rFonts w:cs="Arial"/>
-          <w:b/>
-        </w:rPr>
-        <w:t>Manuscript submission</w:t>
-      </w:r>
-      <w:commentRangeEnd w:id="3"/>
-      <w:r>
-        <w:rPr>
-          <w:rStyle w:val="CommentReference"/>
-          <w:rFonts w:cs="Arial"/>
-          <w:b/>
-          <w:sz w:val="22"/>
-          <w:szCs w:val="22"/>
-        </w:rPr>
-        <w:commentReference w:id="3"/>
-      </w:r>
-      <w:r>
-        <w:rPr>
-          <w:rFonts w:cs="Arial"/>
-          <w:b/>
-        </w:rPr>
-        <w:t xml:space="preserve">: </w:t>
-      </w:r>
-      <w:r>
-        <w:rPr>
-          <w:rFonts w:cs="Arial"/>
-        </w:rPr>
-        <w:t xml:space="preserve">A draft of the manuscript is expected to be shared with the analyst team within 90 days of receipt of the comprehensive analysis report, and the manuscript to be submitted within 120 </w:t>
-      </w:r>
-      <w:r>
-        <w:rPr>
-          <w:rFonts w:cs="Arial"/>
-        </w:rPr>
-        <w:t>days</w:t>
-      </w:r>
-      <w:r>
-        <w:rPr>
-          <w:rFonts w:cs="Arial"/>
-        </w:rPr>
-        <w:t>.  The investigator is responsible for taking the lead on</w:t>
-      </w:r>
-      <w:r>
-        <w:rPr>
-          <w:rFonts w:cs="Arial"/>
-        </w:rPr>
-        <w:t xml:space="preserve"> writing</w:t>
-      </w:r>
-      <w:r>
-        <w:rPr>
-          <w:rFonts w:cs="Arial"/>
-        </w:rPr>
-        <w:t xml:space="preserve"> all manuscript sections</w:t>
-      </w:r>
-      <w:r>
-        <w:rPr>
-          <w:rFonts w:cs="Arial"/>
-        </w:rPr>
-        <w:t xml:space="preserve"> and making cosmetic</w:t>
-      </w:r>
-      <w:r>
-        <w:rPr>
-          <w:rFonts w:cs="Arial"/>
-        </w:rPr>
-        <w:t>/</w:t>
-      </w:r>
-      <w:r>
-        <w:rPr>
-          <w:rFonts w:cs="Arial"/>
-        </w:rPr>
-        <w:t>formatting changes to tables</w:t>
-      </w:r>
-      <w:r>
-        <w:rPr>
-          <w:rFonts w:cs="Arial"/>
-        </w:rPr>
-        <w:t xml:space="preserve">. </w:t>
-      </w:r>
-      <w:r>
-        <w:rPr>
-          <w:rFonts w:cs="Arial"/>
-        </w:rPr>
-        <w:t xml:space="preserve">  </w:t>
-      </w:r>
-    </w:p>
-    <w:p>
-      <w:pPr>
-        <w:pStyle w:val="ListParagraph"/>
-        <w:ind w:left="360"/>
-        <w:rPr>
-          <w:rFonts w:cs="Arial"/>
-        </w:rPr>
-      </w:pPr>
-    </w:p>
-    <w:p>
-      <w:pPr>
-        <w:pStyle w:val="ListParagraph"/>
-        <w:keepNext/>
-        <w:keepLines/>
-        <w:pBdr>
-          <w:bottom w:val="single" w:sz="8" w:space="1" w:color="auto"/>
-        </w:pBdr>
-        <w:spacing w:before="240" w:after="0"/>
-        <w:ind w:left="0"/>
-        <w:outlineLvl w:val="1"/>
-        <w:rPr>
-          <w:rFonts w:eastAsiaTheme="majorEastAsia" w:cs="Arial"/>
-          <w:b/>
-          <w:color w:val="171717" w:themeColor="background2" w:themeShade="1A"/>
-          <w:sz w:val="28"/>
-          <w:szCs w:val="26"/>
-        </w:rPr>
-      </w:pPr>
-      <w:commentRangeStart w:id="4"/>
-      <w:r>
-        <w:rPr>
-          <w:rFonts w:eastAsiaTheme="majorEastAsia" w:cs="Arial"/>
-          <w:b/>
-          <w:color w:val="171717" w:themeColor="background2" w:themeShade="1A"/>
-          <w:sz w:val="28"/>
-          <w:szCs w:val="26"/>
-        </w:rPr>
-        <w:lastRenderedPageBreak/>
-        <w:t>Timeline / Deadlines</w:t>
-      </w:r>
-      <w:commentRangeEnd w:id="4"/>
-      <w:r>
-        <w:rPr>
-          <w:rStyle w:val="CommentReference"/>
-          <w:rFonts w:eastAsiaTheme="majorEastAsia" w:cs="Arial"/>
-          <w:b/>
-          <w:color w:val="171717" w:themeColor="background2" w:themeShade="1A"/>
-          <w:sz w:val="28"/>
-          <w:szCs w:val="26"/>
-        </w:rPr>
-        <w:commentReference w:id="4"/>
-      </w:r>
-    </w:p>
-    <w:p>
-      <w:pPr>
-        <w:spacing w:before="120"/>
-        <w:rPr>
-          <w:rFonts w:cs="Arial"/>
-        </w:rPr>
-      </w:pPr>
-      <w:r>
-        <w:rPr>
-          <w:rFonts w:cs="Arial"/>
-        </w:rPr>
-        <w:t xml:space="preserve">The </w:t>
-      </w:r>
-      <w:r>
-        <w:rPr>
-          <w:rFonts w:cs="Arial"/>
-        </w:rPr>
-        <w:t>anticipated project start date is</w:t>
-      </w:r>
-      <w:r>
-        <w:rPr>
-          <w:rFonts w:cs="Arial"/>
-        </w:rPr>
-        <w:t xml:space="preserve"> </w:t>
-      </w:r>
-      <w:r>
-        <w:rPr>
-          <w:rFonts w:cs="Arial"/>
-          <w:b/>
-          <w:highlight w:val="yellow"/>
-        </w:rPr>
-        <w:t>6</w:t>
-      </w:r>
-      <w:r>
-        <w:rPr>
-          <w:rFonts w:cs="Arial"/>
-          <w:b/>
-          <w:highlight w:val="yellow"/>
-        </w:rPr>
-        <w:t>/</w:t>
-      </w:r>
-      <w:r>
-        <w:rPr>
-          <w:rFonts w:cs="Arial"/>
-          <w:b/>
-          <w:highlight w:val="yellow"/>
-        </w:rPr>
-        <w:t>2</w:t>
-      </w:r>
-      <w:r>
-        <w:rPr>
-          <w:rFonts w:cs="Arial"/>
-          <w:b/>
-          <w:highlight w:val="yellow"/>
-        </w:rPr>
-        <w:t>/20</w:t>
-      </w:r>
-      <w:r>
-        <w:rPr>
-          <w:rFonts w:cs="Arial"/>
-          <w:b/>
-        </w:rPr>
-        <w:t>25</w:t>
-      </w:r>
-      <w:r>
-        <w:rPr>
-          <w:rFonts w:cs="Arial"/>
-        </w:rPr>
-        <w:t xml:space="preserve"> and </w:t>
-      </w:r>
-      <w:r>
-        <w:rPr>
-          <w:rFonts w:cs="Arial"/>
-        </w:rPr>
-        <w:t>revisions to the Comprehensive Analysis Report</w:t>
-      </w:r>
-      <w:r>
-        <w:rPr>
-          <w:rFonts w:cs="Arial"/>
-        </w:rPr>
-        <w:t xml:space="preserve"> are expected to be</w:t>
-      </w:r>
-      <w:r>
-        <w:rPr>
-          <w:rFonts w:cs="Arial"/>
-        </w:rPr>
-        <w:t xml:space="preserve"> complete </w:t>
-      </w:r>
-      <w:r>
-        <w:rPr>
-          <w:rFonts w:cs="Arial"/>
-        </w:rPr>
-        <w:t xml:space="preserve">by </w:t>
-      </w:r>
-      <w:r>
-        <w:rPr>
-          <w:rFonts w:cs="Arial"/>
-          <w:b/>
-          <w:highlight w:val="yellow"/>
-        </w:rPr>
-        <w:t>7</w:t>
-      </w:r>
-      <w:r>
-        <w:rPr>
-          <w:rFonts w:cs="Arial"/>
-          <w:b/>
-          <w:highlight w:val="yellow"/>
-        </w:rPr>
-        <w:t>/</w:t>
-      </w:r>
-      <w:r>
-        <w:rPr>
-          <w:rFonts w:cs="Arial"/>
-          <w:b/>
-          <w:highlight w:val="yellow"/>
-        </w:rPr>
-        <w:t>31</w:t>
-      </w:r>
-      <w:r>
-        <w:rPr>
-          <w:rFonts w:cs="Arial"/>
-          <w:b/>
-          <w:highlight w:val="yellow"/>
-        </w:rPr>
-        <w:t>/</w:t>
-      </w:r>
-      <w:r>
-        <w:rPr>
-          <w:rFonts w:cs="Arial"/>
-          <w:b/>
-          <w:highlight w:val="yellow"/>
-        </w:rPr>
-        <w:t>2025</w:t>
-      </w:r>
-      <w:r>
-        <w:rPr>
-          <w:rFonts w:cs="Arial"/>
-          <w:highlight w:val="yellow"/>
-        </w:rPr>
-        <w:t>.</w:t>
-      </w:r>
-      <w:r>
-        <w:rPr>
-          <w:rFonts w:cs="Arial"/>
-        </w:rPr>
-        <w:t xml:space="preserve"> </w:t>
-      </w:r>
-      <w:r>
-        <w:rPr>
-          <w:rFonts w:cs="Arial"/>
-        </w:rPr>
-        <w:t xml:space="preserve"> </w:t>
-      </w:r>
-      <w:r>
-        <w:rPr>
-          <w:rFonts w:cs="Arial"/>
-        </w:rPr>
-        <w:t>Approximately one month prior to the project start date, CIDA will reach out to the investigator to confirm the project timeframe</w:t>
-      </w:r>
-      <w:r>
-        <w:rPr>
-          <w:rFonts w:cs="Arial"/>
-        </w:rPr>
-        <w:t xml:space="preserve"> and the project start date may be altered if necessary.</w:t>
-      </w:r>
-    </w:p>
-    <w:p>
-      <w:pPr>
-        <w:rPr>
-          <w:rFonts w:cs="Arial"/>
-          <w:sz w:val="24"/>
-        </w:rPr>
-      </w:pPr>
-      <w:r>
-        <w:rPr>
-          <w:rFonts w:cs="Arial"/>
-        </w:rPr>
-        <w:t xml:space="preserve">A kickoff meeting is to occur no later than </w:t>
-      </w:r>
-      <w:r>
-        <w:rPr>
-          <w:rFonts w:cs="Arial"/>
-          <w:b/>
-          <w:highlight w:val="yellow"/>
-        </w:rPr>
-        <w:t>6</w:t>
-      </w:r>
-      <w:r>
-        <w:rPr>
-          <w:rFonts w:cs="Arial"/>
-          <w:b/>
-          <w:highlight w:val="yellow"/>
-        </w:rPr>
-        <w:t>/</w:t>
-      </w:r>
-      <w:r>
-        <w:rPr>
-          <w:rFonts w:cs="Arial"/>
-          <w:b/>
-          <w:highlight w:val="yellow"/>
-        </w:rPr>
-        <w:t>6</w:t>
-      </w:r>
-      <w:r>
-        <w:rPr>
-          <w:rFonts w:cs="Arial"/>
-          <w:b/>
-          <w:highlight w:val="yellow"/>
-        </w:rPr>
-        <w:t>/</w:t>
-      </w:r>
-      <w:r>
-        <w:rPr>
-          <w:rFonts w:cs="Arial"/>
-          <w:b/>
-          <w:highlight w:val="yellow"/>
-        </w:rPr>
-        <w:t>20</w:t>
-      </w:r>
-      <w:r>
-        <w:rPr>
-          <w:rFonts w:cs="Arial"/>
-          <w:b/>
-        </w:rPr>
-        <w:t>25</w:t>
-      </w:r>
-      <w:r>
-        <w:rPr>
-          <w:rFonts w:cs="Arial"/>
-          <w:b/>
-        </w:rPr>
-        <w:t>.</w:t>
-      </w:r>
-      <w:r>
-        <w:rPr>
-          <w:rFonts w:cs="Arial"/>
-        </w:rPr>
-        <w:t xml:space="preserve">  At least 1 week (7 business days) prior to the kickoff meeting, the Investigator will provide the CIDA analyst(s) with the dataset and other relevant study documentation.  During the kickoff meeting, the project team will d</w:t>
-      </w:r>
-      <w:r>
-        <w:rPr>
-          <w:rFonts w:cs="Arial"/>
-          <w:szCs w:val="20"/>
-        </w:rPr>
-        <w:t>iscuss and review project materials</w:t>
-      </w:r>
-      <w:r>
-        <w:rPr>
-          <w:rFonts w:cs="Arial"/>
-          <w:szCs w:val="20"/>
-        </w:rPr>
-        <w:t xml:space="preserve">, outline and </w:t>
-      </w:r>
-      <w:r>
-        <w:rPr>
-          <w:rFonts w:cs="Arial"/>
-          <w:szCs w:val="20"/>
-        </w:rPr>
-        <w:t>mock up</w:t>
-      </w:r>
-      <w:r>
-        <w:rPr>
-          <w:rFonts w:cs="Arial"/>
-          <w:szCs w:val="20"/>
-        </w:rPr>
-        <w:t xml:space="preserve"> the desired</w:t>
-      </w:r>
-      <w:r>
-        <w:rPr>
-          <w:rFonts w:cs="Arial"/>
-          <w:szCs w:val="20"/>
-        </w:rPr>
-        <w:t xml:space="preserve"> tables and figures (1-2 descriptive tables, 1-2 analysis results tables and up to 4 graphs), outline the data analysis objectives.</w:t>
-      </w:r>
-      <w:r>
-        <w:rPr>
-          <w:rFonts w:cs="Arial"/>
-          <w:szCs w:val="20"/>
-        </w:rPr>
-        <w:t xml:space="preserve">  During the kickoff meeting, the team will e</w:t>
-      </w:r>
-      <w:r>
-        <w:rPr>
-          <w:rFonts w:cs="Arial"/>
-          <w:szCs w:val="20"/>
-        </w:rPr>
-        <w:t>stablish</w:t>
-      </w:r>
-      <w:r>
-        <w:rPr>
-          <w:rFonts w:cs="Arial"/>
-          <w:szCs w:val="20"/>
-        </w:rPr>
-        <w:t xml:space="preserve"> a</w:t>
-      </w:r>
-      <w:r>
-        <w:rPr>
-          <w:rFonts w:cs="Arial"/>
-          <w:szCs w:val="20"/>
-        </w:rPr>
-        <w:t xml:space="preserve"> meeting schedule </w:t>
-      </w:r>
-      <w:r>
-        <w:rPr>
-          <w:rFonts w:cs="Arial"/>
-          <w:szCs w:val="20"/>
-        </w:rPr>
-        <w:t xml:space="preserve">for the duration of the project.  </w:t>
-      </w:r>
-    </w:p>
-    <w:p>
-      <w:pPr>
-        <w:rPr>
-          <w:rFonts w:cs="Arial"/>
-        </w:rPr>
-      </w:pPr>
-      <w:r>
-        <w:rPr>
-          <w:rFonts w:cs="Arial"/>
-        </w:rPr>
-        <w:t>Note: Please select your starting dat</w:t>
-      </w:r>
-      <w:r>
-        <w:rPr>
-          <w:rFonts w:cs="Arial"/>
-        </w:rPr>
-        <w:t>e</w:t>
-      </w:r>
-      <w:r>
-        <w:rPr>
-          <w:rFonts w:cs="Arial"/>
-        </w:rPr>
-        <w:t xml:space="preserve"> carefully. Schedule delays due</w:t>
-      </w:r>
-      <w:r>
-        <w:rPr>
-          <w:rFonts w:cs="Arial"/>
-        </w:rPr>
-        <w:t xml:space="preserve"> to delays in data delivery, in</w:t>
-      </w:r>
-      <w:r>
-        <w:rPr>
-          <w:rFonts w:cs="Arial"/>
-        </w:rPr>
-        <w:t xml:space="preserve">ability for investigator to meet to review work or lack of responsiveness from the investigator will result in a project amendment with additional costs due to the extension in the number of months the project will take to complete. </w:t>
-      </w:r>
-    </w:p>
-    <w:p>
-      <w:pPr>
-        <w:rPr>
-          <w:rFonts w:cs="Arial"/>
-        </w:rPr>
-      </w:pPr>
-    </w:p>
-    <w:p>
-      <w:pPr>
-        <w:keepNext/>
-        <w:keepLines/>
-        <w:pBdr>
-          <w:bottom w:val="single" w:sz="8" w:space="1" w:color="auto"/>
-        </w:pBdr>
-        <w:spacing w:before="240" w:after="0"/>
-        <w:outlineLvl w:val="1"/>
-        <w:rPr>
-          <w:rFonts w:eastAsiaTheme="majorEastAsia" w:cs="Arial"/>
-          <w:b/>
-          <w:color w:val="171717" w:themeColor="background2" w:themeShade="1A"/>
-          <w:sz w:val="28"/>
-          <w:szCs w:val="26"/>
-        </w:rPr>
-      </w:pPr>
-      <w:r>
-        <w:rPr>
-          <w:rFonts w:eastAsiaTheme="majorEastAsia" w:cs="Arial"/>
-          <w:b/>
-          <w:color w:val="171717" w:themeColor="background2" w:themeShade="1A"/>
-          <w:sz w:val="28"/>
-          <w:szCs w:val="26"/>
-          <w:highlight w:val="yellow"/>
-        </w:rPr>
-        <w:t>Estimated Cost</w:t>
-      </w:r>
-    </w:p>
-    <w:p>
-      <w:pPr>
-        <w:spacing w:before="120"/>
-        <w:rPr>
-          <w:rFonts w:cs="Arial"/>
-        </w:rPr>
-      </w:pPr>
-      <w:r>
-        <w:rPr>
-          <w:rFonts w:cs="Arial"/>
-        </w:rPr>
-        <w:t>This represents our best estimate of the effort needed to complete the project. Should the scope of work change substantially, CIDA will discuss changes with the investigator and issue a new or amended project agreement.</w:t>
-      </w:r>
-    </w:p>
-    <w:tbl>
-      <w:tblPr>
-        <w:tblStyle w:val="ListTable4-Accent5"/>
-        <w:tblW w:w="0" w:type="auto"/>
-        <w:tblLook w:val="04A0" w:firstRow="1" w:lastRow="0" w:firstColumn="1" w:lastColumn="0" w:noHBand="0" w:noVBand="1"/>
-      </w:tblPr>
-      <w:tblGrid>
-        <w:gridCol w:w="1795"/>
-        <w:gridCol w:w="1530"/>
-        <w:gridCol w:w="1890"/>
-        <w:gridCol w:w="1080"/>
-      </w:tblGrid>
-      <w:tr>
-        <w:trPr>
-          <w:cnfStyle w:val="100000000000" w:firstRow="1" w:lastRow="0" w:firstColumn="0" w:lastColumn="0" w:oddVBand="0" w:evenVBand="0" w:oddHBand="0" w:evenHBand="0" w:firstRowFirstColumn="0" w:firstRowLastColumn="0" w:lastRowFirstColumn="0" w:lastRowLastColumn="0"/>
-          <w:trHeight w:val="350"/>
-          <w:tblHeader/>
-        </w:trPr>
-        <w:tc>
-          <w:tcPr>
-            <w:cnfStyle w:val="001000000000" w:firstRow="0" w:lastRow="0" w:firstColumn="1" w:lastColumn="0" w:oddVBand="0" w:evenVBand="0" w:oddHBand="0" w:evenHBand="0" w:firstRowFirstColumn="0" w:firstRowLastColumn="0" w:lastRowFirstColumn="0" w:lastRowLastColumn="0"/>
-            <w:tcW w:w="1795" w:type="dxa"/>
-          </w:tcPr>
-          <w:p>
-            <w:pPr>
-              <w:rPr>
-                <w:rFonts w:cs="Arial"/>
-              </w:rPr>
-            </w:pPr>
-          </w:p>
-        </w:tc>
-        <w:tc>
-          <w:tcPr>
-            <w:tcW w:w="4500" w:type="dxa"/>
-            <w:gridSpan w:val="3"/>
-          </w:tcPr>
-          <w:p>
-            <w:pPr>
-              <w:cnfStyle w:val="100000000000" w:firstRow="1" w:lastRow="0" w:firstColumn="0" w:lastColumn="0" w:oddVBand="0" w:evenVBand="0" w:oddHBand="0" w:evenHBand="0" w:firstRowFirstColumn="0" w:firstRowLastColumn="0" w:lastRowFirstColumn="0" w:lastRowLastColumn="0"/>
-              <w:rPr>
-                <w:b w:val="0"/>
-              </w:rPr>
-            </w:pPr>
-            <w:r>
-              <w:t>Effort</w:t>
-            </w:r>
-          </w:p>
-        </w:tc>
-      </w:tr>
-      <w:tr>
-        <w:trPr>
-          <w:cnfStyle w:val="000000100000" w:firstRow="0" w:lastRow="0" w:firstColumn="0" w:lastColumn="0" w:oddVBand="0" w:evenVBand="0" w:oddHBand="1" w:evenHBand="0" w:firstRowFirstColumn="0" w:firstRowLastColumn="0" w:lastRowFirstColumn="0" w:lastRowLastColumn="0"/>
-        </w:trPr>
-        <w:tc>
-          <w:tcPr>
-            <w:cnfStyle w:val="001000000000" w:firstRow="0" w:lastRow="0" w:firstColumn="1" w:lastColumn="0" w:oddVBand="0" w:evenVBand="0" w:oddHBand="0" w:evenHBand="0" w:firstRowFirstColumn="0" w:firstRowLastColumn="0" w:lastRowFirstColumn="0" w:lastRowLastColumn="0"/>
-            <w:tcW w:w="1795" w:type="dxa"/>
-            <w:shd w:val="clear" w:color="auto" w:fill="auto"/>
-          </w:tcPr>
-          <w:p>
-            <w:pPr>
-              <w:rPr>
-                <w:rFonts w:cs="Arial"/>
-              </w:rPr>
-            </w:pPr>
-            <w:r>
-              <w:rPr>
-                <w:rFonts w:cs="Arial"/>
-              </w:rPr>
-              <w:t>Months</w:t>
-            </w:r>
-          </w:p>
-        </w:tc>
-        <w:tc>
-          <w:tcPr>
-            <w:tcW w:w="1530" w:type="dxa"/>
-            <w:shd w:val="clear" w:color="auto" w:fill="auto"/>
-          </w:tcPr>
-          <w:p>
-            <w:pPr>
-              <w:cnfStyle w:val="000000100000" w:firstRow="0" w:lastRow="0" w:firstColumn="0" w:lastColumn="0" w:oddVBand="0" w:evenVBand="0" w:oddHBand="1" w:evenHBand="0" w:firstRowFirstColumn="0" w:firstRowLastColumn="0" w:lastRowFirstColumn="0" w:lastRowLastColumn="0"/>
-              <w:rPr>
-                <w:rFonts w:cs="Arial"/>
-              </w:rPr>
-            </w:pPr>
-            <w:r>
-              <w:rPr>
-                <w:rFonts w:cs="Arial"/>
-              </w:rPr>
-              <w:t>PhD Faculty</w:t>
-            </w:r>
-          </w:p>
-        </w:tc>
-        <w:tc>
-          <w:tcPr>
-            <w:tcW w:w="1890" w:type="dxa"/>
-            <w:shd w:val="clear" w:color="auto" w:fill="auto"/>
-          </w:tcPr>
-          <w:p>
-            <w:pPr>
-              <w:cnfStyle w:val="000000100000" w:firstRow="0" w:lastRow="0" w:firstColumn="0" w:lastColumn="0" w:oddVBand="0" w:evenVBand="0" w:oddHBand="1" w:evenHBand="0" w:firstRowFirstColumn="0" w:firstRowLastColumn="0" w:lastRowFirstColumn="0" w:lastRowLastColumn="0"/>
-              <w:rPr>
-                <w:rFonts w:cs="Arial"/>
-              </w:rPr>
-            </w:pPr>
-            <w:r>
-              <w:rPr>
-                <w:rFonts w:cs="Arial"/>
-              </w:rPr>
-              <w:t>Master’s Faculty</w:t>
-            </w:r>
-          </w:p>
-        </w:tc>
-        <w:tc>
-          <w:tcPr>
-            <w:tcW w:w="1080" w:type="dxa"/>
-            <w:shd w:val="clear" w:color="auto" w:fill="auto"/>
-          </w:tcPr>
-          <w:p>
-            <w:pPr>
-              <w:cnfStyle w:val="000000100000" w:firstRow="0" w:lastRow="0" w:firstColumn="0" w:lastColumn="0" w:oddVBand="0" w:evenVBand="0" w:oddHBand="1" w:evenHBand="0" w:firstRowFirstColumn="0" w:firstRowLastColumn="0" w:lastRowFirstColumn="0" w:lastRowLastColumn="0"/>
-              <w:rPr>
-                <w:rFonts w:cs="Arial"/>
-              </w:rPr>
-            </w:pPr>
-            <w:r>
-              <w:rPr>
-                <w:rFonts w:cs="Arial"/>
-              </w:rPr>
-              <w:t>Student</w:t>
-            </w:r>
-          </w:p>
-        </w:tc>
-      </w:tr>
-      <w:tr>
-        <w:tc>
-          <w:tcPr>
-            <w:cnfStyle w:val="001000000000" w:firstRow="0" w:lastRow="0" w:firstColumn="1" w:lastColumn="0" w:oddVBand="0" w:evenVBand="0" w:oddHBand="0" w:evenHBand="0" w:firstRowFirstColumn="0" w:firstRowLastColumn="0" w:lastRowFirstColumn="0" w:lastRowLastColumn="0"/>
-            <w:tcW w:w="1795" w:type="dxa"/>
-          </w:tcPr>
-          <w:p>
-            <w:pPr>
-              <w:rPr>
-                <w:rFonts w:cs="Arial"/>
-                <w:highlight w:val="yellow"/>
-              </w:rPr>
-            </w:pPr>
-            <w:r>
-              <w:rPr>
-                <w:rFonts w:cs="Arial"/>
-                <w:highlight w:val="yellow"/>
-              </w:rPr>
-              <w:t>2</w:t>
-            </w:r>
-          </w:p>
-        </w:tc>
-        <w:tc>
-          <w:tcPr>
-            <w:tcW w:w="1530" w:type="dxa"/>
-          </w:tcPr>
-          <w:p>
-            <w:pPr>
-              <w:cnfStyle w:val="000000000000" w:firstRow="0" w:lastRow="0" w:firstColumn="0" w:lastColumn="0" w:oddVBand="0" w:evenVBand="0" w:oddHBand="0" w:evenHBand="0" w:firstRowFirstColumn="0" w:firstRowLastColumn="0" w:lastRowFirstColumn="0" w:lastRowLastColumn="0"/>
-              <w:rPr>
-                <w:rFonts w:cs="Arial"/>
-                <w:highlight w:val="yellow"/>
-              </w:rPr>
-            </w:pPr>
-            <w:r>
-              <w:rPr>
-                <w:rFonts w:cs="Arial"/>
-                <w:highlight w:val="yellow"/>
-              </w:rPr>
-              <w:t>5%</w:t>
-            </w:r>
-          </w:p>
-        </w:tc>
-        <w:tc>
-          <w:tcPr>
-            <w:tcW w:w="1890" w:type="dxa"/>
-          </w:tcPr>
-          <w:p>
-            <w:pPr>
-              <w:cnfStyle w:val="000000000000" w:firstRow="0" w:lastRow="0" w:firstColumn="0" w:lastColumn="0" w:oddVBand="0" w:evenVBand="0" w:oddHBand="0" w:evenHBand="0" w:firstRowFirstColumn="0" w:firstRowLastColumn="0" w:lastRowFirstColumn="0" w:lastRowLastColumn="0"/>
-              <w:rPr>
-                <w:rFonts w:cs="Arial"/>
-                <w:highlight w:val="yellow"/>
-              </w:rPr>
-            </w:pPr>
-            <w:r>
-              <w:rPr>
-                <w:rFonts w:cs="Arial"/>
-                <w:highlight w:val="yellow"/>
-              </w:rPr>
-              <w:t>2</w:t>
-            </w:r>
-            <w:r>
-              <w:rPr>
-                <w:rFonts w:cs="Arial"/>
-                <w:highlight w:val="yellow"/>
-              </w:rPr>
-              <w:t>0%</w:t>
-            </w:r>
-          </w:p>
-        </w:tc>
-        <w:tc>
-          <w:tcPr>
-            <w:tcW w:w="1080" w:type="dxa"/>
-          </w:tcPr>
-          <w:p>
-            <w:pPr>
-              <w:cnfStyle w:val="000000000000" w:firstRow="0" w:lastRow="0" w:firstColumn="0" w:lastColumn="0" w:oddVBand="0" w:evenVBand="0" w:oddHBand="0" w:evenHBand="0" w:firstRowFirstColumn="0" w:firstRowLastColumn="0" w:lastRowFirstColumn="0" w:lastRowLastColumn="0"/>
-              <w:rPr>
-                <w:rFonts w:cs="Arial"/>
-                <w:highlight w:val="yellow"/>
-              </w:rPr>
-            </w:pPr>
-          </w:p>
-        </w:tc>
-      </w:tr>
-      <w:tr>
-        <w:trPr>
-          <w:cnfStyle w:val="000000100000" w:firstRow="0" w:lastRow="0" w:firstColumn="0" w:lastColumn="0" w:oddVBand="0" w:evenVBand="0" w:oddHBand="1" w:evenHBand="0" w:firstRowFirstColumn="0" w:firstRowLastColumn="0" w:lastRowFirstColumn="0" w:lastRowLastColumn="0"/>
-        </w:trPr>
-        <w:tc>
-          <w:tcPr>
-            <w:cnfStyle w:val="001000000000" w:firstRow="0" w:lastRow="0" w:firstColumn="1" w:lastColumn="0" w:oddVBand="0" w:evenVBand="0" w:oddHBand="0" w:evenHBand="0" w:firstRowFirstColumn="0" w:firstRowLastColumn="0" w:lastRowFirstColumn="0" w:lastRowLastColumn="0"/>
-            <w:tcW w:w="1795" w:type="dxa"/>
-            <w:shd w:val="clear" w:color="auto" w:fill="auto"/>
-          </w:tcPr>
-          <w:p>
-            <w:pPr>
-              <w:rPr>
-                <w:rFonts w:cs="Arial"/>
-                <w:highlight w:val="yellow"/>
-              </w:rPr>
-            </w:pPr>
-          </w:p>
-        </w:tc>
-        <w:tc>
-          <w:tcPr>
-            <w:tcW w:w="1530" w:type="dxa"/>
-            <w:shd w:val="clear" w:color="auto" w:fill="auto"/>
-          </w:tcPr>
-          <w:p>
-            <w:pPr>
-              <w:cnfStyle w:val="000000100000" w:firstRow="0" w:lastRow="0" w:firstColumn="0" w:lastColumn="0" w:oddVBand="0" w:evenVBand="0" w:oddHBand="1" w:evenHBand="0" w:firstRowFirstColumn="0" w:firstRowLastColumn="0" w:lastRowFirstColumn="0" w:lastRowLastColumn="0"/>
-              <w:rPr>
-                <w:rFonts w:cs="Arial"/>
-                <w:highlight w:val="yellow"/>
-              </w:rPr>
-            </w:pPr>
-          </w:p>
-        </w:tc>
-        <w:tc>
-          <w:tcPr>
-            <w:tcW w:w="1890" w:type="dxa"/>
-            <w:shd w:val="clear" w:color="auto" w:fill="auto"/>
-          </w:tcPr>
-          <w:p>
-            <w:pPr>
-              <w:cnfStyle w:val="000000100000" w:firstRow="0" w:lastRow="0" w:firstColumn="0" w:lastColumn="0" w:oddVBand="0" w:evenVBand="0" w:oddHBand="1" w:evenHBand="0" w:firstRowFirstColumn="0" w:firstRowLastColumn="0" w:lastRowFirstColumn="0" w:lastRowLastColumn="0"/>
-              <w:rPr>
-                <w:rFonts w:cs="Arial"/>
-                <w:highlight w:val="yellow"/>
-              </w:rPr>
-            </w:pPr>
-          </w:p>
-        </w:tc>
-        <w:tc>
-          <w:tcPr>
-            <w:tcW w:w="1080" w:type="dxa"/>
-            <w:shd w:val="clear" w:color="auto" w:fill="auto"/>
-          </w:tcPr>
-          <w:p>
-            <w:pPr>
-              <w:cnfStyle w:val="000000100000" w:firstRow="0" w:lastRow="0" w:firstColumn="0" w:lastColumn="0" w:oddVBand="0" w:evenVBand="0" w:oddHBand="1" w:evenHBand="0" w:firstRowFirstColumn="0" w:firstRowLastColumn="0" w:lastRowFirstColumn="0" w:lastRowLastColumn="0"/>
-              <w:rPr>
-                <w:rFonts w:cs="Arial"/>
-                <w:highlight w:val="yellow"/>
-              </w:rPr>
-            </w:pPr>
-          </w:p>
-        </w:tc>
-      </w:tr>
-      <w:tr>
-        <w:tc>
-          <w:tcPr>
-            <w:cnfStyle w:val="001000000000" w:firstRow="0" w:lastRow="0" w:firstColumn="1" w:lastColumn="0" w:oddVBand="0" w:evenVBand="0" w:oddHBand="0" w:evenHBand="0" w:firstRowFirstColumn="0" w:firstRowLastColumn="0" w:lastRowFirstColumn="0" w:lastRowLastColumn="0"/>
-            <w:tcW w:w="1795" w:type="dxa"/>
-          </w:tcPr>
-          <w:p>
-            <w:pPr>
-              <w:rPr>
-                <w:rFonts w:cs="Arial"/>
-                <w:highlight w:val="yellow"/>
-              </w:rPr>
-            </w:pPr>
-          </w:p>
-        </w:tc>
-        <w:tc>
-          <w:tcPr>
-            <w:tcW w:w="1530" w:type="dxa"/>
-          </w:tcPr>
-          <w:p>
-            <w:pPr>
-              <w:cnfStyle w:val="000000000000" w:firstRow="0" w:lastRow="0" w:firstColumn="0" w:lastColumn="0" w:oddVBand="0" w:evenVBand="0" w:oddHBand="0" w:evenHBand="0" w:firstRowFirstColumn="0" w:firstRowLastColumn="0" w:lastRowFirstColumn="0" w:lastRowLastColumn="0"/>
-              <w:rPr>
-                <w:rFonts w:cs="Arial"/>
-                <w:b/>
-                <w:highlight w:val="yellow"/>
-              </w:rPr>
-            </w:pPr>
-          </w:p>
-        </w:tc>
-        <w:tc>
-          <w:tcPr>
-            <w:tcW w:w="1890" w:type="dxa"/>
-          </w:tcPr>
-          <w:p>
-            <w:pPr>
-              <w:cnfStyle w:val="000000000000" w:firstRow="0" w:lastRow="0" w:firstColumn="0" w:lastColumn="0" w:oddVBand="0" w:evenVBand="0" w:oddHBand="0" w:evenHBand="0" w:firstRowFirstColumn="0" w:firstRowLastColumn="0" w:lastRowFirstColumn="0" w:lastRowLastColumn="0"/>
-              <w:rPr>
-                <w:rFonts w:cs="Arial"/>
-                <w:b/>
-                <w:highlight w:val="yellow"/>
-              </w:rPr>
-            </w:pPr>
-            <w:r>
-              <w:rPr>
-                <w:rFonts w:cs="Arial"/>
-                <w:b/>
-                <w:highlight w:val="yellow"/>
-              </w:rPr>
-              <w:t>Total Costs</w:t>
-            </w:r>
-          </w:p>
-        </w:tc>
-        <w:tc>
-          <w:tcPr>
-            <w:tcW w:w="1080" w:type="dxa"/>
-          </w:tcPr>
-          <w:p>
-            <w:pPr>
-              <w:cnfStyle w:val="000000000000" w:firstRow="0" w:lastRow="0" w:firstColumn="0" w:lastColumn="0" w:oddVBand="0" w:evenVBand="0" w:oddHBand="0" w:evenHBand="0" w:firstRowFirstColumn="0" w:firstRowLastColumn="0" w:lastRowFirstColumn="0" w:lastRowLastColumn="0"/>
-              <w:rPr>
-                <w:rFonts w:cs="Arial"/>
-                <w:b/>
-                <w:highlight w:val="yellow"/>
-              </w:rPr>
-            </w:pPr>
-            <w:r>
-              <w:rPr>
-                <w:rFonts w:cs="Arial"/>
-                <w:b/>
-                <w:highlight w:val="yellow"/>
-              </w:rPr>
-              <w:t>$</w:t>
-            </w:r>
-            <w:r>
-              <w:rPr>
-                <w:rFonts w:cs="Arial"/>
-                <w:b/>
-                <w:highlight w:val="yellow"/>
-              </w:rPr>
-              <w:t>12,400</w:t>
-            </w:r>
-          </w:p>
-        </w:tc>
-      </w:tr>
-    </w:tbl>
-    <w:p>
-      <w:pPr>
-        <w:rPr>
-          <w:rFonts w:cs="Arial"/>
-        </w:rPr>
-      </w:pPr>
-    </w:p>
-    <w:p>
-      <w:pPr>
-        <w:rPr>
-          <w:rFonts w:cs="Arial"/>
-        </w:rPr>
-      </w:pPr>
-      <w:r>
-        <w:rPr>
-          <w:rFonts w:cs="Arial"/>
-        </w:rPr>
-        <w:t xml:space="preserve">Please </w:t>
-      </w:r>
-      <w:r>
-        <w:rPr>
-          <w:rFonts w:cs="Arial"/>
-        </w:rPr>
-        <w:t>Remember</w:t>
-      </w:r>
-      <w:r>
-        <w:rPr>
-          <w:rFonts w:cs="Arial"/>
-        </w:rPr>
-        <w:t xml:space="preserve">:  </w:t>
-      </w:r>
-      <w:r>
-        <w:rPr>
-          <w:rFonts w:cs="Arial"/>
-        </w:rPr>
-        <w:t>T</w:t>
-      </w:r>
-      <w:r>
-        <w:rPr>
-          <w:rFonts w:cs="Arial"/>
-        </w:rPr>
-        <w:t xml:space="preserve">he manuscript draft must be provided to the biostatistician within </w:t>
-      </w:r>
-      <w:r>
-        <w:rPr>
-          <w:rFonts w:cs="Arial"/>
-        </w:rPr>
-        <w:t>90 days</w:t>
-      </w:r>
-      <w:r>
-        <w:rPr>
-          <w:rFonts w:cs="Arial"/>
-        </w:rPr>
-        <w:t xml:space="preserve"> after receipt of the Comprehensive Analysis Report revisio</w:t>
-      </w:r>
-      <w:r>
-        <w:rPr>
-          <w:rFonts w:cs="Arial"/>
-        </w:rPr>
-        <w:t>ns, otherwise an amendment with additional charges may be required.</w:t>
-      </w:r>
-    </w:p>
-    <w:p>
-      <w:pPr>
-        <w:keepNext/>
-        <w:keepLines/>
-        <w:pBdr>
-          <w:bottom w:val="single" w:sz="8" w:space="1" w:color="auto"/>
-        </w:pBdr>
-        <w:spacing w:before="240" w:after="0"/>
-        <w:outlineLvl w:val="1"/>
-        <w:rPr>
-          <w:rFonts w:eastAsiaTheme="majorEastAsia" w:cs="Arial"/>
-          <w:b/>
-          <w:color w:val="171717" w:themeColor="background2" w:themeShade="1A"/>
-          <w:sz w:val="28"/>
-          <w:szCs w:val="26"/>
-        </w:rPr>
-      </w:pPr>
-      <w:r>
-        <w:rPr>
-          <w:rFonts w:eastAsiaTheme="majorEastAsia" w:cs="Arial"/>
-          <w:b/>
-          <w:color w:val="171717" w:themeColor="background2" w:themeShade="1A"/>
-          <w:sz w:val="28"/>
-          <w:szCs w:val="26"/>
-        </w:rPr>
-        <w:t>Billing</w:t>
-      </w:r>
-    </w:p>
-    <w:p>
-      <w:pPr>
-        <w:spacing w:before="120"/>
-        <w:rPr>
-          <w:rFonts w:cs="Arial"/>
-        </w:rPr>
-      </w:pPr>
-      <w:r>
-        <w:rPr>
-          <w:rFonts w:cs="Arial"/>
-        </w:rPr>
-        <w:t>CIDA will bill in the following manner:</w:t>
-      </w:r>
-    </w:p>
-    <w:p>
-      <w:pPr>
-        <w:pStyle w:val="ListParagraph"/>
-        <w:numPr>
-          <w:ilvl w:val="0"/>
-          <w:numId w:val="6"/>
-        </w:numPr>
-        <w:rPr>
-          <w:rFonts w:cs="Arial"/>
-        </w:rPr>
-      </w:pPr>
-      <w:r>
-        <w:rPr>
-          <w:rFonts w:cs="Arial"/>
-        </w:rPr>
-        <w:t>A</w:t>
-      </w:r>
-      <w:r>
-        <w:rPr>
-          <w:rFonts w:cs="Arial"/>
-        </w:rPr>
-        <w:t xml:space="preserve"> nonrefundable </w:t>
-      </w:r>
-      <w:r>
-        <w:rPr>
-          <w:rFonts w:cs="Arial"/>
-        </w:rPr>
-        <w:t xml:space="preserve">10% during the next billing cycle after </w:t>
-      </w:r>
-      <w:r>
-        <w:rPr>
-          <w:rFonts w:cs="Arial"/>
-        </w:rPr>
-        <w:t>contract approval.</w:t>
-      </w:r>
-      <w:r>
-        <w:rPr>
-          <w:rFonts w:cs="Arial"/>
-        </w:rPr>
-        <w:t xml:space="preserve">  </w:t>
-      </w:r>
-    </w:p>
-    <w:p>
-      <w:pPr>
-        <w:pStyle w:val="ListParagraph"/>
-        <w:numPr>
-          <w:ilvl w:val="0"/>
-          <w:numId w:val="6"/>
-        </w:numPr>
-        <w:rPr>
-          <w:rFonts w:cs="Arial"/>
-        </w:rPr>
-      </w:pPr>
-      <w:r>
-        <w:rPr>
-          <w:rFonts w:cs="Arial"/>
-        </w:rPr>
-        <w:t xml:space="preserve">We will bill quarterly throughout the duration of the project, and </w:t>
-      </w:r>
-      <w:r>
-        <w:rPr>
-          <w:rFonts w:cs="Arial"/>
-        </w:rPr>
-        <w:t>a</w:t>
-      </w:r>
-      <w:r>
-        <w:rPr>
-          <w:rFonts w:cs="Arial"/>
-        </w:rPr>
-        <w:t>ny remaining balance will be billed upon completion of the Comprehensive Analysis Report Revisions</w:t>
-      </w:r>
-      <w:r>
-        <w:rPr>
-          <w:rFonts w:cs="Arial"/>
-        </w:rPr>
-        <w:t>.</w:t>
-      </w:r>
-      <w:r>
-        <w:rPr>
-          <w:rFonts w:cs="Arial"/>
-        </w:rPr>
-        <w:t xml:space="preserve">  </w:t>
-      </w:r>
-    </w:p>
-    <w:p>
-      <w:pPr>
-        <w:pStyle w:val="ListParagraph"/>
-        <w:numPr>
-          <w:ilvl w:val="0"/>
-          <w:numId w:val="6"/>
-        </w:numPr>
-        <w:rPr>
-          <w:rFonts w:cs="Arial"/>
-        </w:rPr>
-      </w:pPr>
-      <w:r>
-        <w:rPr>
-          <w:rFonts w:cs="Arial"/>
-        </w:rPr>
-        <w:t>Billing is done through Crosslabs (formerly iLab) or an IN form.</w:t>
-      </w:r>
-    </w:p>
-    <w:p>
-      <w:pPr>
-        <w:pStyle w:val="Heading3"/>
-        <w:rPr>
-          <w:rFonts w:asciiTheme="minorHAnsi" w:hAnsiTheme="minorHAnsi"/>
-          <w:b w:val="0"/>
-          <w:sz w:val="22"/>
-          <w:szCs w:val="22"/>
-        </w:rPr>
-      </w:pPr>
-      <w:r>
-        <w:rPr>
-          <w:rFonts w:asciiTheme="minorHAnsi" w:hAnsiTheme="minorHAnsi"/>
-          <w:b w:val="0"/>
-          <w:sz w:val="22"/>
-          <w:szCs w:val="22"/>
-        </w:rPr>
-        <w:t xml:space="preserve">For questions regarding project billing, please contact </w:t>
-      </w:r>
-      <w:hyperlink r:id="rId20" w:history="1">
-        <w:r>
-          <w:rPr>
-            <w:rStyle w:val="Hyperlink"/>
-            <w:rFonts w:asciiTheme="minorHAnsi" w:hAnsiTheme="minorHAnsi"/>
-            <w:b w:val="0"/>
-            <w:sz w:val="22"/>
-            <w:szCs w:val="22"/>
-          </w:rPr>
-          <w:t>cida.admin@ucdenver.edu</w:t>
-        </w:r>
-      </w:hyperlink>
-      <w:r>
-        <w:rPr>
-          <w:rFonts w:asciiTheme="minorHAnsi" w:hAnsiTheme="minorHAnsi"/>
-          <w:b w:val="0"/>
-          <w:sz w:val="22"/>
-          <w:szCs w:val="22"/>
-        </w:rPr>
-        <w:t>.</w:t>
-      </w:r>
-    </w:p>
-    <w:p>
-      <w:pPr>
-        <w:pStyle w:val="Heading3"/>
-        <w:rPr>
-          <w:rFonts w:cs="Arial"/>
-        </w:rPr>
-      </w:pPr>
-      <w:r>
-        <w:rPr>
-          <w:rFonts w:asciiTheme="minorHAnsi" w:hAnsiTheme="minorHAnsi"/>
-          <w:sz w:val="22"/>
-          <w:szCs w:val="22"/>
-        </w:rPr>
-        <w:t>CIDA’s right to cancel or close out a project</w:t>
-      </w:r>
-      <w:r>
-        <w:rPr>
-          <w:rFonts w:asciiTheme="minorHAnsi" w:hAnsiTheme="minorHAnsi"/>
-          <w:sz w:val="22"/>
-          <w:szCs w:val="22"/>
-        </w:rPr>
-        <w:t xml:space="preserve">:  </w:t>
-      </w:r>
-      <w:r>
-        <w:rPr>
-          <w:rFonts w:asciiTheme="minorHAnsi" w:hAnsiTheme="minorHAnsi"/>
-          <w:b w:val="0"/>
-          <w:sz w:val="22"/>
-          <w:szCs w:val="22"/>
-        </w:rPr>
-        <w:t xml:space="preserve">SOWs not approved </w:t>
-      </w:r>
-      <w:r>
-        <w:rPr>
-          <w:rFonts w:asciiTheme="minorHAnsi" w:hAnsiTheme="minorHAnsi"/>
-          <w:b w:val="0"/>
-          <w:sz w:val="22"/>
-          <w:szCs w:val="22"/>
-        </w:rPr>
-        <w:t xml:space="preserve">within 30 days will be closed. </w:t>
-      </w:r>
-      <w:r>
-        <w:rPr>
-          <w:rFonts w:asciiTheme="minorHAnsi" w:hAnsiTheme="minorHAnsi"/>
-          <w:b w:val="0"/>
-          <w:sz w:val="22"/>
-          <w:szCs w:val="22"/>
-        </w:rPr>
-        <w:t xml:space="preserve"> </w:t>
-      </w:r>
-      <w:r>
-        <w:rPr>
-          <w:rFonts w:asciiTheme="minorHAnsi" w:hAnsiTheme="minorHAnsi"/>
-          <w:b w:val="0"/>
-          <w:sz w:val="22"/>
-          <w:szCs w:val="22"/>
-        </w:rPr>
-        <w:t>Projects which remain inactive for over 60 days will be closed unless prior arrangements have been made, and a final bill will be sent</w:t>
-      </w:r>
-      <w:r>
-        <w:rPr>
-          <w:rFonts w:asciiTheme="minorHAnsi" w:hAnsiTheme="minorHAnsi"/>
-          <w:b w:val="0"/>
-          <w:sz w:val="22"/>
-          <w:szCs w:val="22"/>
-        </w:rPr>
-        <w:t xml:space="preserve">.  </w:t>
-      </w:r>
-    </w:p>
-    <w:p>
-      <w:pPr>
-        <w:rPr>
-          <w:rFonts w:cs="Arial"/>
-        </w:rPr>
-      </w:pPr>
-    </w:p>
-    <w:p>
-      <w:pPr>
-        <w:keepNext/>
-        <w:keepLines/>
-        <w:pBdr>
-          <w:bottom w:val="single" w:sz="8" w:space="1" w:color="auto"/>
-        </w:pBdr>
-        <w:spacing w:before="240" w:after="0"/>
-        <w:outlineLvl w:val="1"/>
-        <w:rPr>
-          <w:rFonts w:eastAsiaTheme="majorEastAsia" w:cs="Arial"/>
-          <w:b/>
-          <w:color w:val="171717" w:themeColor="background2" w:themeShade="1A"/>
-          <w:sz w:val="26"/>
-          <w:szCs w:val="26"/>
-        </w:rPr>
-      </w:pPr>
-      <w:r>
-        <w:rPr>
-          <w:rFonts w:eastAsiaTheme="majorEastAsia" w:cs="Arial"/>
-          <w:b/>
-          <w:color w:val="171717" w:themeColor="background2" w:themeShade="1A"/>
-          <w:sz w:val="26"/>
-          <w:szCs w:val="26"/>
-        </w:rPr>
-        <w:lastRenderedPageBreak/>
-        <w:t>Approval of Agreement</w:t>
-      </w:r>
-    </w:p>
-    <w:p>
-      <w:pPr>
-        <w:rPr>
-          <w:rFonts w:cs="Arial"/>
-        </w:rPr>
-      </w:pPr>
-      <w:r>
-        <w:rPr>
-          <w:rFonts w:cs="Arial"/>
-        </w:rPr>
-        <w:t xml:space="preserve">By approving this Scope of Work Agreement, you are acknowledging that you have read and agree to the project costs and milestones, timelines, project details, and terms and conditions outlined in this document. </w:t>
-      </w:r>
-    </w:p>
-    <w:p>
-      <w:pPr>
-        <w:rPr>
-          <w:rFonts w:cs="Arial"/>
-          <w:b/>
-        </w:rPr>
-      </w:pPr>
-      <w:r>
-        <w:rPr>
-          <w:rFonts w:cs="Arial"/>
-          <w:b/>
-        </w:rPr>
-        <w:t xml:space="preserve">To approve this Scope of Work </w:t>
-      </w:r>
-      <w:r>
-        <w:rPr>
-          <w:rFonts w:cs="Arial"/>
-          <w:b/>
-        </w:rPr>
-        <w:t>Agreement</w:t>
-      </w:r>
-      <w:r>
-        <w:rPr>
-          <w:rFonts w:cs="Arial"/>
-          <w:b/>
-        </w:rPr>
-        <w:t>,</w:t>
-      </w:r>
-      <w:r>
-        <w:rPr>
-          <w:rFonts w:cs="Arial"/>
-          <w:b/>
-        </w:rPr>
-        <w:t xml:space="preserve"> click the </w:t>
-      </w:r>
-      <w:r>
-        <w:rPr>
-          <w:rFonts w:cs="Arial"/>
-          <w:b/>
-        </w:rPr>
-        <w:t xml:space="preserve">link in the email you received from Smartsheet. </w:t>
-      </w:r>
-    </w:p>
-    <w:p>
-      <w:pPr>
-        <w:rPr>
-          <w:rFonts w:cs="Arial"/>
-        </w:rPr>
-      </w:pPr>
-      <w:r>
-        <w:rPr>
-          <w:rFonts w:cs="Arial"/>
-        </w:rPr>
-        <w:t xml:space="preserve">You will need to accept the terms and conditions and update your billing information. </w:t>
-      </w:r>
-    </w:p>
-    <w:p>
-      <w:pPr>
-        <w:rPr>
-          <w:rFonts w:cs="Arial"/>
-        </w:rPr>
-      </w:pPr>
-    </w:p>
-    <w:p>
-      <w:pPr>
-        <w:rPr>
-          <w:rFonts w:cs="Arial"/>
-        </w:rPr>
-      </w:pPr>
-    </w:p>
-    <w:p>
-      <w:pPr>
-        <w:rPr>
-          <w:rFonts w:cs="Arial"/>
-        </w:rPr>
-      </w:pPr>
-    </w:p>
-    <w:p>
-      <w:pPr>
-        <w:rPr>
-          <w:rFonts w:cs="Arial"/>
-        </w:rPr>
-      </w:pPr>
-      <w:r>
-        <w:rPr>
-          <w:rFonts w:cs="Arial"/>
-        </w:rPr>
-        <w:t>Notes on OSCI:</w:t>
-      </w:r>
-    </w:p>
-    <w:p>
-      <w:pPr>
-        <w:rPr>
-          <w:rFonts w:cs="Arial"/>
-        </w:rPr>
-      </w:pPr>
-      <w:r>
-        <w:rPr>
-          <w:rFonts w:cs="Arial"/>
-        </w:rPr>
-        <w:t>Students get to practice and demonstrate clinical skills in a standardized medical scenario</w:t>
-      </w:r>
-    </w:p>
-    <w:p>
-      <w:pPr>
-        <w:rPr>
-          <w:rFonts w:cs="Arial"/>
-        </w:rPr>
-      </w:pPr>
-      <w:r>
-        <w:rPr>
-          <w:rFonts w:cs="Arial"/>
-        </w:rPr>
-        <w:t>OSCE stations may include:</w:t>
-      </w:r>
-    </w:p>
-    <w:p>
-      <w:pPr>
-        <w:pStyle w:val="ListParagraph"/>
-        <w:numPr>
-          <w:ilvl w:val="0"/>
-          <w:numId w:val="6"/>
-        </w:numPr>
-        <w:rPr>
-          <w:rFonts w:cs="Arial"/>
-        </w:rPr>
-      </w:pPr>
-      <w:r>
-        <w:rPr>
-          <w:rFonts w:cs="Arial"/>
-        </w:rPr>
-        <w:t>Clinical interactions with standardized patients: counseling, examination, history taking</w:t>
-      </w:r>
-    </w:p>
-    <w:p>
-      <w:pPr>
-        <w:pStyle w:val="ListParagraph"/>
-        <w:numPr>
-          <w:ilvl w:val="0"/>
-          <w:numId w:val="6"/>
-        </w:numPr>
-        <w:rPr>
-          <w:rFonts w:cs="Arial"/>
-        </w:rPr>
-      </w:pPr>
-      <w:r>
-        <w:rPr>
-          <w:rFonts w:cs="Arial"/>
-        </w:rPr>
-        <w:t>Examination of mannequins and interpretation of findings</w:t>
-      </w:r>
-    </w:p>
-    <w:p>
-      <w:pPr>
-        <w:pStyle w:val="ListParagraph"/>
-        <w:numPr>
-          <w:ilvl w:val="0"/>
-          <w:numId w:val="6"/>
-        </w:numPr>
-        <w:rPr>
-          <w:rFonts w:cs="Arial"/>
-        </w:rPr>
-      </w:pPr>
-      <w:r>
-        <w:rPr>
-          <w:rFonts w:cs="Arial"/>
-        </w:rPr>
-        <w:t>Test Interpretation</w:t>
-      </w:r>
-    </w:p>
-    <w:p>
-      <w:pPr>
-        <w:pStyle w:val="ListParagraph"/>
-        <w:numPr>
-          <w:ilvl w:val="0"/>
-          <w:numId w:val="6"/>
-        </w:numPr>
-        <w:rPr>
-          <w:rFonts w:cs="Arial"/>
-        </w:rPr>
-      </w:pPr>
-      <w:r>
-        <w:rPr>
-          <w:rFonts w:cs="Arial"/>
-        </w:rPr>
-        <w:t>Order Writing</w:t>
-      </w:r>
-    </w:p>
-    <w:p>
-      <w:pPr>
-        <w:rPr>
-          <w:rFonts w:cs="Arial"/>
-        </w:rPr>
-      </w:pPr>
-      <w:r>
-        <w:rPr>
-          <w:rFonts w:cs="Arial"/>
-        </w:rPr>
-        <w:t>What did we talk about when the video cut off?</w:t>
-      </w:r>
-    </w:p>
-    <w:p>
-      <w:pPr>
-        <w:pStyle w:val="ListParagraph"/>
-        <w:numPr>
-          <w:ilvl w:val="0"/>
-          <w:numId w:val="6"/>
-        </w:numPr>
-        <w:rPr>
-          <w:rFonts w:cs="Arial"/>
-        </w:rPr>
-      </w:pPr>
-      <w:r>
-        <w:rPr>
-          <w:rFonts w:cs="Arial"/>
-        </w:rPr>
-        <w:t>If one of the component scores is missing, we will keep this student in the dataset.</w:t>
-      </w:r>
-    </w:p>
-    <w:p>
-      <w:pPr>
-        <w:pStyle w:val="ListParagraph"/>
-        <w:numPr>
-          <w:ilvl w:val="0"/>
-          <w:numId w:val="6"/>
-        </w:numPr>
-        <w:rPr>
-          <w:rFonts w:cs="Arial"/>
-        </w:rPr>
-      </w:pPr>
-      <w:r>
-        <w:rPr>
-          <w:rFonts w:cs="Arial"/>
-        </w:rPr>
-        <w:t>Students missing more than one of the scores should be flagged for the investigator to assess.</w:t>
-      </w:r>
-    </w:p>
-    <w:p>
-      <w:pPr>
-        <w:pStyle w:val="ListParagraph"/>
-        <w:numPr>
-          <w:ilvl w:val="0"/>
-          <w:numId w:val="6"/>
-        </w:numPr>
-        <w:rPr>
-          <w:rFonts w:cs="Arial"/>
-        </w:rPr>
-      </w:pPr>
-      <w:r>
-        <w:rPr>
-          <w:rFonts w:cs="Arial"/>
-        </w:rPr>
-        <w:t>The intended end product of this is presentation at the CUSOM Academy of Medical Educator conference.</w:t>
-      </w:r>
-    </w:p>
-    <w:p>
-      <w:pPr>
-        <w:rPr>
-          <w:rFonts w:cs="Arial"/>
-        </w:rPr>
-      </w:pPr>
-    </w:p>
-    <w:p>
-      <w:pPr>
-        <w:rPr>
-          <w:rFonts w:cs="Arial"/>
-        </w:rPr>
-      </w:pPr>
-    </w:p>
-    <w:p>
-      <w:pPr>
-        <w:pStyle w:val="ListParagraph"/>
-        <w:numPr>
-          <w:ilvl w:val="0"/>
-          <w:numId w:val="9"/>
-        </w:numPr>
-        <w:rPr>
-          <w:highlight w:val="yellow"/>
-        </w:rPr>
-      </w:pPr>
-      <w:r>
-        <w:rPr>
-          <w:highlight w:val="yellow"/>
-        </w:rPr>
-        <w:t>Collected the scores from all the different disciplines</w:t>
-      </w:r>
-    </w:p>
-    <w:p>
-      <w:pPr>
-        <w:pStyle w:val="ListParagraph"/>
-        <w:numPr>
-          <w:ilvl w:val="0"/>
-          <w:numId w:val="9"/>
-        </w:numPr>
-        <w:rPr>
-          <w:highlight w:val="yellow"/>
-        </w:rPr>
-      </w:pPr>
-      <w:r>
-        <w:rPr>
-          <w:highlight w:val="yellow"/>
-        </w:rPr>
-        <w:t>Only have the preclinical AUSCI scores</w:t>
-      </w:r>
-    </w:p>
-    <w:p>
-      <w:pPr>
-        <w:pStyle w:val="ListParagraph"/>
-        <w:numPr>
-          <w:ilvl w:val="1"/>
-          <w:numId w:val="9"/>
-        </w:numPr>
-        <w:rPr>
-          <w:highlight w:val="yellow"/>
-        </w:rPr>
-      </w:pPr>
-      <w:r>
-        <w:rPr>
-          <w:highlight w:val="yellow"/>
-        </w:rPr>
-        <w:t>They do one each semester</w:t>
-      </w:r>
-    </w:p>
-    <w:p>
-      <w:pPr>
-        <w:pStyle w:val="ListParagraph"/>
-        <w:numPr>
-          <w:ilvl w:val="1"/>
-          <w:numId w:val="9"/>
-        </w:numPr>
-        <w:rPr>
-          <w:highlight w:val="yellow"/>
-        </w:rPr>
-      </w:pPr>
-      <w:r>
-        <w:rPr>
-          <w:highlight w:val="yellow"/>
-        </w:rPr>
-        <w:t>We have a handful of scores across different years</w:t>
-      </w:r>
-    </w:p>
-    <w:p>
-      <w:pPr>
-        <w:pStyle w:val="ListParagraph"/>
-        <w:numPr>
-          <w:ilvl w:val="0"/>
-          <w:numId w:val="9"/>
-        </w:numPr>
-        <w:rPr>
-          <w:highlight w:val="yellow"/>
-        </w:rPr>
-      </w:pPr>
-      <w:r>
-        <w:rPr>
-          <w:highlight w:val="yellow"/>
-        </w:rPr>
-        <w:t>How do you treat the individual scores?</w:t>
-      </w:r>
-    </w:p>
-    <w:p>
-      <w:pPr>
-        <w:pStyle w:val="ListParagraph"/>
-        <w:numPr>
-          <w:ilvl w:val="1"/>
-          <w:numId w:val="9"/>
-        </w:numPr>
-        <w:rPr>
-          <w:highlight w:val="yellow"/>
-        </w:rPr>
-      </w:pPr>
-      <w:r>
-        <w:rPr>
-          <w:highlight w:val="yellow"/>
-        </w:rPr>
-        <w:t>P1 and P2 refers to first and second year</w:t>
-      </w:r>
-    </w:p>
-    <w:p>
-      <w:pPr>
-        <w:pStyle w:val="ListParagraph"/>
-        <w:numPr>
-          <w:ilvl w:val="1"/>
-          <w:numId w:val="9"/>
-        </w:numPr>
-        <w:rPr>
-          <w:highlight w:val="yellow"/>
-        </w:rPr>
-      </w:pPr>
-      <w:r>
-        <w:rPr>
-          <w:highlight w:val="yellow"/>
-        </w:rPr>
-        <w:t>Fall or SPR refers to spring or fall</w:t>
-      </w:r>
-    </w:p>
-    <w:p>
-      <w:pPr>
-        <w:pStyle w:val="ListParagraph"/>
-        <w:numPr>
-          <w:ilvl w:val="1"/>
-          <w:numId w:val="9"/>
-        </w:numPr>
-        <w:rPr>
-          <w:highlight w:val="yellow"/>
-        </w:rPr>
-      </w:pPr>
-      <w:r>
-        <w:rPr>
-          <w:highlight w:val="yellow"/>
-        </w:rPr>
-        <w:t>Then different parts of the case study – three domains, which are currently treated separately</w:t>
-      </w:r>
-    </w:p>
-    <w:p>
-      <w:pPr>
-        <w:pStyle w:val="ListParagraph"/>
-        <w:numPr>
-          <w:ilvl w:val="1"/>
-          <w:numId w:val="9"/>
-        </w:numPr>
-        <w:rPr>
-          <w:highlight w:val="yellow"/>
-        </w:rPr>
-      </w:pPr>
-      <w:r>
-        <w:rPr>
-          <w:highlight w:val="yellow"/>
-        </w:rPr>
-        <w:t>Different people grade different components</w:t>
-      </w:r>
-    </w:p>
-    <w:p>
-      <w:pPr>
-        <w:pStyle w:val="ListParagraph"/>
-        <w:numPr>
-          <w:ilvl w:val="1"/>
-          <w:numId w:val="9"/>
-        </w:numPr>
-        <w:rPr>
-          <w:highlight w:val="yellow"/>
-        </w:rPr>
-      </w:pPr>
-      <w:r>
-        <w:rPr>
-          <w:highlight w:val="yellow"/>
-        </w:rPr>
-        <w:t>Most interested in the communication and physical exam score</w:t>
-      </w:r>
-    </w:p>
-    <w:p>
-      <w:pPr>
-        <w:pStyle w:val="ListParagraph"/>
-        <w:numPr>
-          <w:ilvl w:val="0"/>
-          <w:numId w:val="9"/>
-        </w:numPr>
-        <w:rPr>
-          <w:highlight w:val="yellow"/>
-        </w:rPr>
-      </w:pPr>
-      <w:r>
-        <w:rPr>
-          <w:highlight w:val="yellow"/>
-        </w:rPr>
-        <w:t>Doing something very exploratory</w:t>
-      </w:r>
-    </w:p>
-    <w:p>
-      <w:pPr>
-        <w:pStyle w:val="ListParagraph"/>
-        <w:numPr>
-          <w:ilvl w:val="0"/>
-          <w:numId w:val="9"/>
-        </w:numPr>
-        <w:rPr>
-          <w:highlight w:val="yellow"/>
-        </w:rPr>
-      </w:pPr>
-      <w:r>
-        <w:rPr>
-          <w:highlight w:val="yellow"/>
-        </w:rPr>
-        <w:t>What might be driving the differences between these scores?</w:t>
-      </w:r>
-    </w:p>
-    <w:p>
-      <w:pPr>
-        <w:rPr>
-          <w:rFonts w:cs="Arial"/>
-        </w:rPr>
-      </w:pPr>
     </w:p>
     <w:sectPr>
-      <w:headerReference w:type="default" r:id="rId21"/>
-      <w:footerReference w:type="default" r:id="rId22"/>
+      <w:headerReference w:type="default" r:id="rId12"/>
+      <w:footerReference w:type="default" r:id="rId13"/>
       <w:pgSz w:w="12240" w:h="15840"/>
       <w:pgMar w:top="720" w:right="720" w:bottom="720" w:left="720" w:header="720" w:footer="720" w:gutter="0"/>
       <w:cols w:space="720"/>
@@ -3575,258 +1167,6 @@
     </w:sectPr>
   </w:body>
 </w:document>
-</file>
-
-<file path=word/comments.xml><?xml version="1.0" encoding="utf-8"?>
-<w:comments xmlns:wpc="http://schemas.microsoft.com/office/word/2010/wordprocessingCanvas" xmlns:cx="http://schemas.microsoft.com/office/drawing/2014/chartex" xmlns:cx1="http://schemas.microsoft.com/office/drawing/2015/9/8/chartex" xmlns:cx2="http://schemas.microsoft.com/office/drawing/2015/10/21/chartex" xmlns:cx3="http://schemas.microsoft.com/office/drawing/2016/5/9/chartex" xmlns:cx4="http://schemas.microsoft.com/office/drawing/2016/5/10/chartex" xmlns:cx5="http://schemas.microsoft.com/office/drawing/2016/5/11/chartex" xmlns:cx6="http://schemas.microsoft.com/office/drawing/2016/5/12/chartex" xmlns:cx7="http://schemas.microsoft.com/office/drawing/2016/5/13/chartex" xmlns:cx8="http://schemas.microsoft.com/office/drawing/2016/5/14/chartex" xmlns:mc="http://schemas.openxmlformats.org/markup-compatibility/2006" xmlns:aink="http://schemas.microsoft.com/office/drawing/2016/ink" xmlns:am3d="http://schemas.microsoft.com/office/drawing/2017/model3d" xmlns:o="urn:schemas-microsoft-com:office:office" xmlns:oel="http://schemas.microsoft.com/office/2019/extlst" xmlns:r="http://schemas.openxmlformats.org/officeDocument/2006/relationships" xmlns:m="http://schemas.openxmlformats.org/officeDocument/2006/math" xmlns:v="urn:schemas-microsoft-com:vml" xmlns:wp14="http://schemas.microsoft.com/office/word/2010/wordprocessingDrawing" xmlns:wp="http://schemas.openxmlformats.org/drawingml/2006/wordprocessingDrawing" xmlns:w10="urn:schemas-microsoft-com:office:word" xmlns:w="http://schemas.openxmlformats.org/wordprocessingml/2006/main" xmlns:w14="http://schemas.microsoft.com/office/word/2010/wordml" xmlns:w15="http://schemas.microsoft.com/office/word/2012/wordml" xmlns:w16cex="http://schemas.microsoft.com/office/word/2018/wordml/cex" xmlns:w16cid="http://schemas.microsoft.com/office/word/2016/wordml/cid" xmlns:w16="http://schemas.microsoft.com/office/word/2018/wordml" xmlns:w16du="http://schemas.microsoft.com/office/word/2023/wordml/word16du" xmlns:w16sdtdh="http://schemas.microsoft.com/office/word/2020/wordml/sdtdatahash" xmlns:w16sdtfl="http://schemas.microsoft.com/office/word/2024/wordml/sdtformatlock" xmlns:w16se="http://schemas.microsoft.com/office/word/2015/wordml/symex" xmlns:wpg="http://schemas.microsoft.com/office/word/2010/wordprocessingGroup" xmlns:wpi="http://schemas.microsoft.com/office/word/2010/wordprocessingInk" xmlns:wne="http://schemas.microsoft.com/office/word/2006/wordml" xmlns:wps="http://schemas.microsoft.com/office/word/2010/wordprocessingShape" mc:Ignorable="w14 w15 w16se w16cid w16 w16cex w16sdtdh w16sdtfl w16du wp14">
-  <w:comment w:id="0" w:author="Hochheimer, Camille" w:date="2022-05-05T11:03:00Z" w:initials="HC">
-    <w:p>
-      <w:pPr>
-        <w:pStyle w:val="CommentText"/>
-        <w:numPr>
-          <w:ilvl w:val="0"/>
-          <w:numId w:val="11"/>
-        </w:numPr>
-      </w:pPr>
-      <w:r>
-        <w:rPr>
-          <w:rStyle w:val="CommentReference"/>
-        </w:rPr>
-        <w:annotationRef/>
-      </w:r>
-      <w:r>
-        <w:t>Will these deliverables be sufficient for your needs?</w:t>
-      </w:r>
-    </w:p>
-    <w:p>
-      <w:pPr>
-        <w:pStyle w:val="CommentText"/>
-        <w:numPr>
-          <w:ilvl w:val="0"/>
-          <w:numId w:val="11"/>
-        </w:numPr>
-      </w:pPr>
-      <w:r>
-        <w:t>If we do not find the effect(s) you are hoping to see in our analysis, or if the results run counter to your current expectations, what would be your preferred course of action?</w:t>
-      </w:r>
-      <w:r>
-        <w:t xml:space="preserve"> </w:t>
-      </w:r>
-    </w:p>
-    <w:p>
-      <w:pPr>
-        <w:pStyle w:val="CommentText"/>
-        <w:numPr>
-          <w:ilvl w:val="1"/>
-          <w:numId w:val="11"/>
-        </w:numPr>
-      </w:pPr>
-      <w:r>
-        <w:t>S</w:t>
-      </w:r>
-      <w:r>
-        <w:t>ubmit anyway</w:t>
-      </w:r>
-    </w:p>
-    <w:p>
-      <w:pPr>
-        <w:pStyle w:val="CommentText"/>
-        <w:numPr>
-          <w:ilvl w:val="1"/>
-          <w:numId w:val="11"/>
-        </w:numPr>
-      </w:pPr>
-      <w:r>
-        <w:t>A</w:t>
-      </w:r>
-      <w:r>
-        <w:t>bstract instead</w:t>
-      </w:r>
-    </w:p>
-    <w:p>
-      <w:pPr>
-        <w:pStyle w:val="CommentText"/>
-        <w:numPr>
-          <w:ilvl w:val="1"/>
-          <w:numId w:val="11"/>
-        </w:numPr>
-      </w:pPr>
-      <w:r>
-        <w:rPr>
-          <w:highlight w:val="yellow"/>
-        </w:rPr>
-        <w:t>I</w:t>
-      </w:r>
-      <w:r>
-        <w:rPr>
-          <w:highlight w:val="yellow"/>
-        </w:rPr>
-        <w:t>nvestigate different analyses/outcomes understanding that this will involve a new SOW</w:t>
-      </w:r>
-    </w:p>
-    <w:p>
-      <w:pPr>
-        <w:pStyle w:val="CommentText"/>
-        <w:numPr>
-          <w:ilvl w:val="1"/>
-          <w:numId w:val="11"/>
-        </w:numPr>
-      </w:pPr>
-      <w:r>
-        <w:t>Discard the project</w:t>
-      </w:r>
-    </w:p>
-    <w:p>
-      <w:pPr>
-        <w:pStyle w:val="CommentText"/>
-        <w:numPr>
-          <w:ilvl w:val="1"/>
-          <w:numId w:val="11"/>
-        </w:numPr>
-      </w:pPr>
-      <w:r>
-        <w:t>Other</w:t>
-      </w:r>
-    </w:p>
-  </w:comment>
-  <w:comment w:id="1" w:author="Hochheimer, Camille" w:date="2022-05-05T11:05:00Z" w:initials="HC">
-    <w:p>
-      <w:pPr>
-        <w:pStyle w:val="CommentText"/>
-      </w:pPr>
-      <w:r>
-        <w:rPr>
-          <w:rStyle w:val="CommentReference"/>
-        </w:rPr>
-        <w:annotationRef/>
-      </w:r>
-      <w:r>
-        <w:t xml:space="preserve">Our expectations include authorship, reasonable communication times, </w:t>
-      </w:r>
-      <w:r>
-        <w:t>and agreement to the parameters</w:t>
-      </w:r>
-      <w:r>
-        <w:t xml:space="preserve"> (including limitations)</w:t>
-      </w:r>
-      <w:r>
-        <w:t xml:space="preserve"> of this SOW.</w:t>
-      </w:r>
-      <w:r>
-        <w:t xml:space="preserve"> Substantial data management warrants authorship!</w:t>
-      </w:r>
-    </w:p>
-  </w:comment>
-  <w:comment w:id="2" w:author="Hochheimer, Camille" w:date="2022-05-05T13:16:00Z" w:initials="HC">
-    <w:p>
-      <w:pPr>
-        <w:pStyle w:val="CommentText"/>
-      </w:pPr>
-      <w:r>
-        <w:rPr>
-          <w:rStyle w:val="CommentReference"/>
-        </w:rPr>
-        <w:annotationRef/>
-      </w:r>
-      <w:r>
-        <w:t>Add caveat that if we receive the data and data management needs are more in depth than expected, this will result in an increase in the scope/cost of the project</w:t>
-      </w:r>
-    </w:p>
-  </w:comment>
-  <w:comment w:id="3" w:author="Hochheimer, Camille" w:date="2025-06-02T16:06:00Z" w:initials="CH">
-    <w:p>
-      <w:pPr>
-        <w:pStyle w:val="CommentText"/>
-      </w:pPr>
-      <w:r>
-        <w:rPr>
-          <w:rStyle w:val="CommentReference"/>
-        </w:rPr>
-        <w:annotationRef/>
-      </w:r>
-      <w:r>
-        <w:t>Again, want to make sure they have the capacity to actually publish this work in this timeline</w:t>
-      </w:r>
-    </w:p>
-  </w:comment>
-  <w:comment w:id="4" w:author="Hochheimer, Camille" w:date="2022-05-05T13:19:00Z" w:initials="HC">
-    <w:p>
-      <w:pPr>
-        <w:pStyle w:val="CommentText"/>
-        <w:numPr>
-          <w:ilvl w:val="0"/>
-          <w:numId w:val="12"/>
-        </w:numPr>
-      </w:pPr>
-      <w:r>
-        <w:rPr>
-          <w:rStyle w:val="CommentReference"/>
-        </w:rPr>
-        <w:annotationRef/>
-      </w:r>
-      <w:r>
-        <w:t>Are there any deadlines that we should be aware of</w:t>
-      </w:r>
-      <w:r>
-        <w:t xml:space="preserve"> (even if we can’t meet them)</w:t>
-      </w:r>
-      <w:r>
-        <w:t>?</w:t>
-      </w:r>
-      <w:r>
-        <w:t xml:space="preserve"> Reminder that </w:t>
-      </w:r>
-      <w:r>
-        <w:t>communication lags/delays in data delivery may affect this</w:t>
-      </w:r>
-      <w:r>
-        <w:t xml:space="preserve"> </w:t>
-      </w:r>
-    </w:p>
-    <w:p>
-      <w:pPr>
-        <w:pStyle w:val="CommentText"/>
-        <w:numPr>
-          <w:ilvl w:val="0"/>
-          <w:numId w:val="12"/>
-        </w:numPr>
-      </w:pPr>
-      <w:r>
-        <w:t>What is a good timeline for these deliverables?</w:t>
-      </w:r>
-    </w:p>
-  </w:comment>
-</w:comments>
-</file>
-
-<file path=word/commentsExtended.xml><?xml version="1.0" encoding="utf-8"?>
-<w15:commentsEx xmlns:wpc="http://schemas.microsoft.com/office/word/2010/wordprocessingCanvas" xmlns:cx="http://schemas.microsoft.com/office/drawing/2014/chartex" xmlns:cx1="http://schemas.microsoft.com/office/drawing/2015/9/8/chartex" xmlns:cx2="http://schemas.microsoft.com/office/drawing/2015/10/21/chartex" xmlns:cx3="http://schemas.microsoft.com/office/drawing/2016/5/9/chartex" xmlns:cx4="http://schemas.microsoft.com/office/drawing/2016/5/10/chartex" xmlns:cx5="http://schemas.microsoft.com/office/drawing/2016/5/11/chartex" xmlns:cx6="http://schemas.microsoft.com/office/drawing/2016/5/12/chartex" xmlns:cx7="http://schemas.microsoft.com/office/drawing/2016/5/13/chartex" xmlns:cx8="http://schemas.microsoft.com/office/drawing/2016/5/14/chartex" xmlns:mc="http://schemas.openxmlformats.org/markup-compatibility/2006" xmlns:aink="http://schemas.microsoft.com/office/drawing/2016/ink" xmlns:am3d="http://schemas.microsoft.com/office/drawing/2017/model3d" xmlns:o="urn:schemas-microsoft-com:office:office" xmlns:oel="http://schemas.microsoft.com/office/2019/extlst" xmlns:r="http://schemas.openxmlformats.org/officeDocument/2006/relationships" xmlns:m="http://schemas.openxmlformats.org/officeDocument/2006/math" xmlns:v="urn:schemas-microsoft-com:vml" xmlns:wp14="http://schemas.microsoft.com/office/word/2010/wordprocessingDrawing" xmlns:wp="http://schemas.openxmlformats.org/drawingml/2006/wordprocessingDrawing" xmlns:w10="urn:schemas-microsoft-com:office:word" xmlns:w="http://schemas.openxmlformats.org/wordprocessingml/2006/main" xmlns:w14="http://schemas.microsoft.com/office/word/2010/wordml" xmlns:w15="http://schemas.microsoft.com/office/word/2012/wordml" xmlns:w16cex="http://schemas.microsoft.com/office/word/2018/wordml/cex" xmlns:w16cid="http://schemas.microsoft.com/office/word/2016/wordml/cid" xmlns:w16="http://schemas.microsoft.com/office/word/2018/wordml" xmlns:w16du="http://schemas.microsoft.com/office/word/2023/wordml/word16du" xmlns:w16sdtdh="http://schemas.microsoft.com/office/word/2020/wordml/sdtdatahash" xmlns:w16sdtfl="http://schemas.microsoft.com/office/word/2024/wordml/sdtformatlock" xmlns:w16se="http://schemas.microsoft.com/office/word/2015/wordml/symex" xmlns:wpg="http://schemas.microsoft.com/office/word/2010/wordprocessingGroup" xmlns:wpi="http://schemas.microsoft.com/office/word/2010/wordprocessingInk" xmlns:wne="http://schemas.microsoft.com/office/word/2006/wordml" xmlns:wps="http://schemas.microsoft.com/office/word/2010/wordprocessingShape" mc:Ignorable="w14 w15 w16se w16cid w16 w16cex w16sdtdh w16sdtfl w16du wp14">
-  <w15:commentEx w15:paraId="68119C52" w15:done="0"/>
-  <w15:commentEx w15:paraId="39D5CC83" w15:done="0"/>
-  <w15:commentEx w15:paraId="54644E4F" w15:done="0"/>
-  <w15:commentEx w15:paraId="3AD7912D" w15:done="0"/>
-  <w15:commentEx w15:paraId="2B87A06D" w15:done="0"/>
-</w15:commentsEx>
-</file>
-
-<file path=word/commentsExtensible.xml><?xml version="1.0" encoding="utf-8"?>
-<w16cex:commentsExtensible xmlns:wpc="http://schemas.microsoft.com/office/word/2010/wordprocessingCanvas" xmlns:cx="http://schemas.microsoft.com/office/drawing/2014/chartex" xmlns:cx1="http://schemas.microsoft.com/office/drawing/2015/9/8/chartex" xmlns:cx2="http://schemas.microsoft.com/office/drawing/2015/10/21/chartex" xmlns:cx3="http://schemas.microsoft.com/office/drawing/2016/5/9/chartex" xmlns:cx4="http://schemas.microsoft.com/office/drawing/2016/5/10/chartex" xmlns:cx5="http://schemas.microsoft.com/office/drawing/2016/5/11/chartex" xmlns:cx6="http://schemas.microsoft.com/office/drawing/2016/5/12/chartex" xmlns:cx7="http://schemas.microsoft.com/office/drawing/2016/5/13/chartex" xmlns:cx8="http://schemas.microsoft.com/office/drawing/2016/5/14/chartex" xmlns:cr="http://schemas.microsoft.com/office/comments/2020/reactions" xmlns:mc="http://schemas.openxmlformats.org/markup-compatibility/2006" xmlns:aink="http://schemas.microsoft.com/office/drawing/2016/ink" xmlns:am3d="http://schemas.microsoft.com/office/drawing/2017/model3d" xmlns:o="urn:schemas-microsoft-com:office:office" xmlns:oel="http://schemas.microsoft.com/office/2019/extlst" xmlns:r="http://schemas.openxmlformats.org/officeDocument/2006/relationships" xmlns:m="http://schemas.openxmlformats.org/officeDocument/2006/math" xmlns:v="urn:schemas-microsoft-com:vml" xmlns:wp14="http://schemas.microsoft.com/office/word/2010/wordprocessingDrawing" xmlns:wp="http://schemas.openxmlformats.org/drawingml/2006/wordprocessingDrawing" xmlns:w10="urn:schemas-microsoft-com:office:word" xmlns:w="http://schemas.openxmlformats.org/wordprocessingml/2006/main" xmlns:w14="http://schemas.microsoft.com/office/word/2010/wordml" xmlns:w15="http://schemas.microsoft.com/office/word/2012/wordml" xmlns:w16cex="http://schemas.microsoft.com/office/word/2018/wordml/cex" xmlns:w16cid="http://schemas.microsoft.com/office/word/2016/wordml/cid" xmlns:w16="http://schemas.microsoft.com/office/word/2018/wordml" xmlns:w16du="http://schemas.microsoft.com/office/word/2023/wordml/word16du" xmlns:w16sdtdh="http://schemas.microsoft.com/office/word/2020/wordml/sdtdatahash" xmlns:w16sdtfl="http://schemas.microsoft.com/office/word/2024/wordml/sdtformatlock" xmlns:w16se="http://schemas.microsoft.com/office/word/2015/wordml/symex" xmlns:wpg="http://schemas.microsoft.com/office/word/2010/wordprocessingGroup" xmlns:wpi="http://schemas.microsoft.com/office/word/2010/wordprocessingInk" xmlns:wne="http://schemas.microsoft.com/office/word/2006/wordml" xmlns:wps="http://schemas.microsoft.com/office/word/2010/wordprocessingShape" mc:Ignorable="w14 w15 w16se w16cid w16 w16cex w16sdtdh w16sdtfl cr w16du wp14">
-  <w16cex:commentExtensible w16cex:durableId="261E1161" w16cex:dateUtc="2022-05-05T15:03:00Z"/>
-  <w16cex:commentExtensible w16cex:durableId="261E11DB" w16cex:dateUtc="2022-05-05T15:05:00Z"/>
-  <w16cex:commentExtensible w16cex:durableId="261E3075" w16cex:dateUtc="2022-05-05T17:16:00Z"/>
-  <w16cex:commentExtensible w16cex:durableId="62E18A20" w16cex:dateUtc="2025-06-02T22:06:00Z"/>
-  <w16cex:commentExtensible w16cex:durableId="261E3132" w16cex:dateUtc="2022-05-05T17:19:00Z"/>
-</w16cex:commentsExtensible>
-</file>
-
-<file path=word/commentsIds.xml><?xml version="1.0" encoding="utf-8"?>
-<w16cid:commentsIds xmlns:wpc="http://schemas.microsoft.com/office/word/2010/wordprocessingCanvas" xmlns:cx="http://schemas.microsoft.com/office/drawing/2014/chartex" xmlns:cx1="http://schemas.microsoft.com/office/drawing/2015/9/8/chartex" xmlns:cx2="http://schemas.microsoft.com/office/drawing/2015/10/21/chartex" xmlns:cx3="http://schemas.microsoft.com/office/drawing/2016/5/9/chartex" xmlns:cx4="http://schemas.microsoft.com/office/drawing/2016/5/10/chartex" xmlns:cx5="http://schemas.microsoft.com/office/drawing/2016/5/11/chartex" xmlns:cx6="http://schemas.microsoft.com/office/drawing/2016/5/12/chartex" xmlns:cx7="http://schemas.microsoft.com/office/drawing/2016/5/13/chartex" xmlns:cx8="http://schemas.microsoft.com/office/drawing/2016/5/14/chartex" xmlns:mc="http://schemas.openxmlformats.org/markup-compatibility/2006" xmlns:aink="http://schemas.microsoft.com/office/drawing/2016/ink" xmlns:am3d="http://schemas.microsoft.com/office/drawing/2017/model3d" xmlns:o="urn:schemas-microsoft-com:office:office" xmlns:oel="http://schemas.microsoft.com/office/2019/extlst" xmlns:r="http://schemas.openxmlformats.org/officeDocument/2006/relationships" xmlns:m="http://schemas.openxmlformats.org/officeDocument/2006/math" xmlns:v="urn:schemas-microsoft-com:vml" xmlns:wp14="http://schemas.microsoft.com/office/word/2010/wordprocessingDrawing" xmlns:wp="http://schemas.openxmlformats.org/drawingml/2006/wordprocessingDrawing" xmlns:w10="urn:schemas-microsoft-com:office:word" xmlns:w="http://schemas.openxmlformats.org/wordprocessingml/2006/main" xmlns:w14="http://schemas.microsoft.com/office/word/2010/wordml" xmlns:w15="http://schemas.microsoft.com/office/word/2012/wordml" xmlns:w16cex="http://schemas.microsoft.com/office/word/2018/wordml/cex" xmlns:w16cid="http://schemas.microsoft.com/office/word/2016/wordml/cid" xmlns:w16="http://schemas.microsoft.com/office/word/2018/wordml" xmlns:w16du="http://schemas.microsoft.com/office/word/2023/wordml/word16du" xmlns:w16sdtdh="http://schemas.microsoft.com/office/word/2020/wordml/sdtdatahash" xmlns:w16sdtfl="http://schemas.microsoft.com/office/word/2024/wordml/sdtformatlock" xmlns:w16se="http://schemas.microsoft.com/office/word/2015/wordml/symex" xmlns:wpg="http://schemas.microsoft.com/office/word/2010/wordprocessingGroup" xmlns:wpi="http://schemas.microsoft.com/office/word/2010/wordprocessingInk" xmlns:wne="http://schemas.microsoft.com/office/word/2006/wordml" xmlns:wps="http://schemas.microsoft.com/office/word/2010/wordprocessingShape" mc:Ignorable="w14 w15 w16se w16cid w16 w16cex w16sdtdh w16sdtfl w16du wp14">
-  <w16cid:commentId w16cid:paraId="68119C52" w16cid:durableId="261E1161"/>
-  <w16cid:commentId w16cid:paraId="39D5CC83" w16cid:durableId="261E11DB"/>
-  <w16cid:commentId w16cid:paraId="54644E4F" w16cid:durableId="261E3075"/>
-  <w16cid:commentId w16cid:paraId="3AD7912D" w16cid:durableId="62E18A20"/>
-  <w16cid:commentId w16cid:paraId="2B87A06D" w16cid:durableId="261E3132"/>
-</w16cid:commentsIds>
 </file>
 
 <file path=word/endnotes.xml><?xml version="1.0" encoding="utf-8"?>
@@ -5537,14 +2877,6 @@
     <w:abstractNumId w:val="8"/>
   </w:num>
 </w:numbering>
-</file>
-
-<file path=word/people.xml><?xml version="1.0" encoding="utf-8"?>
-<w15:people xmlns:wpc="http://schemas.microsoft.com/office/word/2010/wordprocessingCanvas" xmlns:cx="http://schemas.microsoft.com/office/drawing/2014/chartex" xmlns:cx1="http://schemas.microsoft.com/office/drawing/2015/9/8/chartex" xmlns:cx2="http://schemas.microsoft.com/office/drawing/2015/10/21/chartex" xmlns:cx3="http://schemas.microsoft.com/office/drawing/2016/5/9/chartex" xmlns:cx4="http://schemas.microsoft.com/office/drawing/2016/5/10/chartex" xmlns:cx5="http://schemas.microsoft.com/office/drawing/2016/5/11/chartex" xmlns:cx6="http://schemas.microsoft.com/office/drawing/2016/5/12/chartex" xmlns:cx7="http://schemas.microsoft.com/office/drawing/2016/5/13/chartex" xmlns:cx8="http://schemas.microsoft.com/office/drawing/2016/5/14/chartex" xmlns:mc="http://schemas.openxmlformats.org/markup-compatibility/2006" xmlns:aink="http://schemas.microsoft.com/office/drawing/2016/ink" xmlns:am3d="http://schemas.microsoft.com/office/drawing/2017/model3d" xmlns:o="urn:schemas-microsoft-com:office:office" xmlns:oel="http://schemas.microsoft.com/office/2019/extlst" xmlns:r="http://schemas.openxmlformats.org/officeDocument/2006/relationships" xmlns:m="http://schemas.openxmlformats.org/officeDocument/2006/math" xmlns:v="urn:schemas-microsoft-com:vml" xmlns:wp14="http://schemas.microsoft.com/office/word/2010/wordprocessingDrawing" xmlns:wp="http://schemas.openxmlformats.org/drawingml/2006/wordprocessingDrawing" xmlns:w10="urn:schemas-microsoft-com:office:word" xmlns:w="http://schemas.openxmlformats.org/wordprocessingml/2006/main" xmlns:w14="http://schemas.microsoft.com/office/word/2010/wordml" xmlns:w15="http://schemas.microsoft.com/office/word/2012/wordml" xmlns:w16cex="http://schemas.microsoft.com/office/word/2018/wordml/cex" xmlns:w16cid="http://schemas.microsoft.com/office/word/2016/wordml/cid" xmlns:w16="http://schemas.microsoft.com/office/word/2018/wordml" xmlns:w16du="http://schemas.microsoft.com/office/word/2023/wordml/word16du" xmlns:w16sdtdh="http://schemas.microsoft.com/office/word/2020/wordml/sdtdatahash" xmlns:w16sdtfl="http://schemas.microsoft.com/office/word/2024/wordml/sdtformatlock" xmlns:w16se="http://schemas.microsoft.com/office/word/2015/wordml/symex" xmlns:wpg="http://schemas.microsoft.com/office/word/2010/wordprocessingGroup" xmlns:wpi="http://schemas.microsoft.com/office/word/2010/wordprocessingInk" xmlns:wne="http://schemas.microsoft.com/office/word/2006/wordml" xmlns:wps="http://schemas.microsoft.com/office/word/2010/wordprocessingShape" mc:Ignorable="w14 w15 w16se w16cid w16 w16cex w16sdtdh w16sdtfl w16du wp14">
-  <w15:person w15:author="Hochheimer, Camille">
-    <w15:presenceInfo w15:providerId="AD" w15:userId="S::camille.hochheimer@cuanschutz.edu::d924e928-0777-4d70-8095-6985b55dd6b5"/>
-  </w15:person>
-</w15:people>
 </file>
 
 <file path=word/styles.xml><?xml version="1.0" encoding="utf-8"?>
@@ -6043,7 +3375,6 @@
   <w:style w:type="character" w:default="1" w:styleId="DefaultParagraphFont">
     <w:name w:val="Default Paragraph Font"/>
     <w:uiPriority w:val="1"/>
-    <w:semiHidden/>
     <w:unhideWhenUsed/>
   </w:style>
   <w:style w:type="table" w:default="1" w:styleId="TableNormal">
@@ -6898,74 +4229,6 @@
 </file>
 
 <file path=customXml/item1.xml><?xml version="1.0" encoding="utf-8"?>
-<?mso-contentType ?>
-<FormTemplates xmlns="http://schemas.microsoft.com/sharepoint/v3/contenttype/forms">
-  <Display>DocumentLibraryForm</Display>
-  <Edit>DocumentLibraryForm</Edit>
-  <New>DocumentLibraryForm</New>
-</FormTemplates>
-</file>
-
-<file path=customXml/item2.xml><?xml version="1.0" encoding="utf-8"?>
-<b:Sources xmlns:b="http://schemas.openxmlformats.org/officeDocument/2006/bibliography" xmlns="http://schemas.openxmlformats.org/officeDocument/2006/bibliography" SelectedStyle="\APASixthEditionOfficeOnline.xsl" StyleName="APA" Version="6"/>
-</file>
-
-<file path=customXml/item3.xml><?xml version="1.0" encoding="utf-8"?>
-<p:properties xmlns:p="http://schemas.microsoft.com/office/2006/metadata/properties" xmlns:xsi="http://www.w3.org/2001/XMLSchema-instance" xmlns:pc="http://schemas.microsoft.com/office/infopath/2007/PartnerControls">
-  <documentManagement>
-    <TeamsChannelId xmlns="01b6a1d5-879d-44ed-91a0-31c394f626b4" xsi:nil="true"/>
-    <Invited_Leaders xmlns="01b6a1d5-879d-44ed-91a0-31c394f626b4" xsi:nil="true"/>
-    <DefaultSectionNames xmlns="01b6a1d5-879d-44ed-91a0-31c394f626b4" xsi:nil="true"/>
-    <Templates xmlns="01b6a1d5-879d-44ed-91a0-31c394f626b4" xsi:nil="true"/>
-    <FolderType xmlns="01b6a1d5-879d-44ed-91a0-31c394f626b4" xsi:nil="true"/>
-    <CultureName xmlns="01b6a1d5-879d-44ed-91a0-31c394f626b4" xsi:nil="true"/>
-    <IsNotebookLocked xmlns="01b6a1d5-879d-44ed-91a0-31c394f626b4" xsi:nil="true"/>
-    <Is_Collaboration_Space_Locked xmlns="01b6a1d5-879d-44ed-91a0-31c394f626b4" xsi:nil="true"/>
-    <Has_Leaders_Only_SectionGroup xmlns="01b6a1d5-879d-44ed-91a0-31c394f626b4" xsi:nil="true"/>
-    <NotebookType xmlns="01b6a1d5-879d-44ed-91a0-31c394f626b4" xsi:nil="true"/>
-    <Leaders xmlns="01b6a1d5-879d-44ed-91a0-31c394f626b4">
-      <UserInfo>
-        <DisplayName/>
-        <AccountId xsi:nil="true"/>
-        <AccountType/>
-      </UserInfo>
-    </Leaders>
-    <Distribution_Groups xmlns="01b6a1d5-879d-44ed-91a0-31c394f626b4" xsi:nil="true"/>
-    <lcf76f155ced4ddcb4097134ff3c332f xmlns="01b6a1d5-879d-44ed-91a0-31c394f626b4">
-      <Terms xmlns="http://schemas.microsoft.com/office/infopath/2007/PartnerControls"/>
-    </lcf76f155ced4ddcb4097134ff3c332f>
-    <LMS_Mappings xmlns="01b6a1d5-879d-44ed-91a0-31c394f626b4" xsi:nil="true"/>
-    <Math_Settings xmlns="01b6a1d5-879d-44ed-91a0-31c394f626b4" xsi:nil="true"/>
-    <Members xmlns="01b6a1d5-879d-44ed-91a0-31c394f626b4">
-      <UserInfo>
-        <DisplayName/>
-        <AccountId xsi:nil="true"/>
-        <AccountType/>
-      </UserInfo>
-    </Members>
-    <Member_Groups xmlns="01b6a1d5-879d-44ed-91a0-31c394f626b4">
-      <UserInfo>
-        <DisplayName/>
-        <AccountId xsi:nil="true"/>
-        <AccountType/>
-      </UserInfo>
-    </Member_Groups>
-    <Owner xmlns="01b6a1d5-879d-44ed-91a0-31c394f626b4">
-      <UserInfo>
-        <DisplayName/>
-        <AccountId xsi:nil="true"/>
-        <AccountType/>
-      </UserInfo>
-    </Owner>
-    <AppVersion xmlns="01b6a1d5-879d-44ed-91a0-31c394f626b4" xsi:nil="true"/>
-    <Invited_Members xmlns="01b6a1d5-879d-44ed-91a0-31c394f626b4" xsi:nil="true"/>
-    <TaxCatchAll xmlns="57eaa26b-6fb5-4fc8-8b16-530ac3965dc8" xsi:nil="true"/>
-    <Self_Registration_Enabled xmlns="01b6a1d5-879d-44ed-91a0-31c394f626b4" xsi:nil="true"/>
-  </documentManagement>
-</p:properties>
-</file>
-
-<file path=customXml/item4.xml><?xml version="1.0" encoding="utf-8"?>
 <ct:contentTypeSchema xmlns:ct="http://schemas.microsoft.com/office/2006/metadata/contentType" xmlns:ma="http://schemas.microsoft.com/office/2006/metadata/properties/metaAttributes" ct:_="" ma:_="" ma:contentTypeName="Document" ma:contentTypeID="0x010100D9900BBE3463A2459DB82DA98F64B4A0" ma:contentTypeVersion="38" ma:contentTypeDescription="Create a new document." ma:contentTypeScope="" ma:versionID="dcee0fda95fa28944246b56b90b7f7a3">
   <xsd:schema xmlns:xsd="http://www.w3.org/2001/XMLSchema" xmlns:xs="http://www.w3.org/2001/XMLSchema" xmlns:p="http://schemas.microsoft.com/office/2006/metadata/properties" xmlns:ns2="01b6a1d5-879d-44ed-91a0-31c394f626b4" xmlns:ns3="57eaa26b-6fb5-4fc8-8b16-530ac3965dc8" targetNamespace="http://schemas.microsoft.com/office/2006/metadata/properties" ma:root="true" ma:fieldsID="bcfcad32e24c9ae598e43146dc149adb" ns2:_="" ns3:_="">
     <xsd:import namespace="01b6a1d5-879d-44ed-91a0-31c394f626b4"/>
@@ -7408,34 +4671,75 @@
 </ct:contentTypeSchema>
 </file>
 
-<file path=customXml/itemProps1.xml><?xml version="1.0" encoding="utf-8"?>
-<ds:datastoreItem xmlns:ds="http://schemas.openxmlformats.org/officeDocument/2006/customXml" ds:itemID="{5AC28F30-25C5-40E2-86AC-997E9D14A90B}">
-  <ds:schemaRefs>
-    <ds:schemaRef ds:uri="http://schemas.microsoft.com/sharepoint/v3/contenttype/forms"/>
-  </ds:schemaRefs>
-</ds:datastoreItem>
+<file path=customXml/item2.xml><?xml version="1.0" encoding="utf-8"?>
+<?mso-contentType ?>
+<FormTemplates xmlns="http://schemas.microsoft.com/sharepoint/v3/contenttype/forms">
+  <Display>DocumentLibraryForm</Display>
+  <Edit>DocumentLibraryForm</Edit>
+  <New>DocumentLibraryForm</New>
+</FormTemplates>
 </file>
 
-<file path=customXml/itemProps2.xml><?xml version="1.0" encoding="utf-8"?>
-<ds:datastoreItem xmlns:ds="http://schemas.openxmlformats.org/officeDocument/2006/customXml" ds:itemID="{083A482D-5E67-482B-8C41-09908A898153}">
-  <ds:schemaRefs>
-    <ds:schemaRef ds:uri="http://schemas.openxmlformats.org/officeDocument/2006/bibliography"/>
-  </ds:schemaRefs>
-</ds:datastoreItem>
+<file path=customXml/item3.xml><?xml version="1.0" encoding="utf-8"?>
+<b:Sources xmlns:b="http://schemas.openxmlformats.org/officeDocument/2006/bibliography" xmlns="http://schemas.openxmlformats.org/officeDocument/2006/bibliography" SelectedStyle="\APASixthEditionOfficeOnline.xsl" StyleName="APA" Version="6"/>
 </file>
 
-<file path=customXml/itemProps3.xml><?xml version="1.0" encoding="utf-8"?>
-<ds:datastoreItem xmlns:ds="http://schemas.openxmlformats.org/officeDocument/2006/customXml" ds:itemID="{5E415542-6724-4A23-B3D4-85865AE81BFB}">
-  <ds:schemaRefs>
-    <ds:schemaRef ds:uri="http://schemas.microsoft.com/office/2006/metadata/properties"/>
-    <ds:schemaRef ds:uri="http://schemas.microsoft.com/office/infopath/2007/PartnerControls"/>
-    <ds:schemaRef ds:uri="01b6a1d5-879d-44ed-91a0-31c394f626b4"/>
-    <ds:schemaRef ds:uri="57eaa26b-6fb5-4fc8-8b16-530ac3965dc8"/>
-  </ds:schemaRefs>
-</ds:datastoreItem>
+<file path=customXml/item4.xml><?xml version="1.0" encoding="utf-8"?>
+<p:properties xmlns:p="http://schemas.microsoft.com/office/2006/metadata/properties" xmlns:xsi="http://www.w3.org/2001/XMLSchema-instance" xmlns:pc="http://schemas.microsoft.com/office/infopath/2007/PartnerControls">
+  <documentManagement>
+    <TeamsChannelId xmlns="01b6a1d5-879d-44ed-91a0-31c394f626b4" xsi:nil="true"/>
+    <Invited_Leaders xmlns="01b6a1d5-879d-44ed-91a0-31c394f626b4" xsi:nil="true"/>
+    <DefaultSectionNames xmlns="01b6a1d5-879d-44ed-91a0-31c394f626b4" xsi:nil="true"/>
+    <Templates xmlns="01b6a1d5-879d-44ed-91a0-31c394f626b4" xsi:nil="true"/>
+    <FolderType xmlns="01b6a1d5-879d-44ed-91a0-31c394f626b4" xsi:nil="true"/>
+    <CultureName xmlns="01b6a1d5-879d-44ed-91a0-31c394f626b4" xsi:nil="true"/>
+    <IsNotebookLocked xmlns="01b6a1d5-879d-44ed-91a0-31c394f626b4" xsi:nil="true"/>
+    <Is_Collaboration_Space_Locked xmlns="01b6a1d5-879d-44ed-91a0-31c394f626b4" xsi:nil="true"/>
+    <Has_Leaders_Only_SectionGroup xmlns="01b6a1d5-879d-44ed-91a0-31c394f626b4" xsi:nil="true"/>
+    <NotebookType xmlns="01b6a1d5-879d-44ed-91a0-31c394f626b4" xsi:nil="true"/>
+    <Leaders xmlns="01b6a1d5-879d-44ed-91a0-31c394f626b4">
+      <UserInfo>
+        <DisplayName/>
+        <AccountId xsi:nil="true"/>
+        <AccountType/>
+      </UserInfo>
+    </Leaders>
+    <Distribution_Groups xmlns="01b6a1d5-879d-44ed-91a0-31c394f626b4" xsi:nil="true"/>
+    <lcf76f155ced4ddcb4097134ff3c332f xmlns="01b6a1d5-879d-44ed-91a0-31c394f626b4">
+      <Terms xmlns="http://schemas.microsoft.com/office/infopath/2007/PartnerControls"/>
+    </lcf76f155ced4ddcb4097134ff3c332f>
+    <LMS_Mappings xmlns="01b6a1d5-879d-44ed-91a0-31c394f626b4" xsi:nil="true"/>
+    <Math_Settings xmlns="01b6a1d5-879d-44ed-91a0-31c394f626b4" xsi:nil="true"/>
+    <Members xmlns="01b6a1d5-879d-44ed-91a0-31c394f626b4">
+      <UserInfo>
+        <DisplayName/>
+        <AccountId xsi:nil="true"/>
+        <AccountType/>
+      </UserInfo>
+    </Members>
+    <Member_Groups xmlns="01b6a1d5-879d-44ed-91a0-31c394f626b4">
+      <UserInfo>
+        <DisplayName/>
+        <AccountId xsi:nil="true"/>
+        <AccountType/>
+      </UserInfo>
+    </Member_Groups>
+    <Owner xmlns="01b6a1d5-879d-44ed-91a0-31c394f626b4">
+      <UserInfo>
+        <DisplayName/>
+        <AccountId xsi:nil="true"/>
+        <AccountType/>
+      </UserInfo>
+    </Owner>
+    <AppVersion xmlns="01b6a1d5-879d-44ed-91a0-31c394f626b4" xsi:nil="true"/>
+    <Invited_Members xmlns="01b6a1d5-879d-44ed-91a0-31c394f626b4" xsi:nil="true"/>
+    <TaxCatchAll xmlns="57eaa26b-6fb5-4fc8-8b16-530ac3965dc8" xsi:nil="true"/>
+    <Self_Registration_Enabled xmlns="01b6a1d5-879d-44ed-91a0-31c394f626b4" xsi:nil="true"/>
+  </documentManagement>
+</p:properties>
 </file>
 
-<file path=customXml/itemProps4.xml><?xml version="1.0" encoding="utf-8"?>
+<file path=customXml/itemProps1.xml><?xml version="1.0" encoding="utf-8"?>
 <ds:datastoreItem xmlns:ds="http://schemas.openxmlformats.org/officeDocument/2006/customXml" ds:itemID="{E4E79D3D-B05D-4EDC-9E90-D67663079556}">
   <ds:schemaRefs>
     <ds:schemaRef ds:uri="http://schemas.microsoft.com/office/2006/metadata/contentType"/>
@@ -7452,4 +4756,31 @@
     <ds:schemaRef ds:uri="http://schemas.microsoft.com/internal/obd"/>
   </ds:schemaRefs>
 </ds:datastoreItem>
+</file>
+
+<file path=customXml/itemProps2.xml><?xml version="1.0" encoding="utf-8"?>
+<ds:datastoreItem xmlns:ds="http://schemas.openxmlformats.org/officeDocument/2006/customXml" ds:itemID="{5AC28F30-25C5-40E2-86AC-997E9D14A90B}">
+  <ds:schemaRefs>
+    <ds:schemaRef ds:uri="http://schemas.microsoft.com/sharepoint/v3/contenttype/forms"/>
+  </ds:schemaRefs>
+</ds:datastoreItem>
+</file>
+
+<file path=customXml/itemProps3.xml><?xml version="1.0" encoding="utf-8"?>
+<ds:datastoreItem xmlns:ds="http://schemas.openxmlformats.org/officeDocument/2006/customXml" ds:itemID="{083A482D-5E67-482B-8C41-09908A898153}">
+  <ds:schemaRefs>
+    <ds:schemaRef ds:uri="http://schemas.openxmlformats.org/officeDocument/2006/bibliography"/>
+  </ds:schemaRefs>
+</ds:datastoreItem>
+</file>
+
+<file path=customXml/itemProps4.xml><?xml version="1.0" encoding="utf-8"?>
+<ds:datastoreItem xmlns:ds="http://schemas.openxmlformats.org/officeDocument/2006/customXml" ds:itemID="{5E415542-6724-4A23-B3D4-85865AE81BFB}">
+  <ds:schemaRefs>
+    <ds:schemaRef ds:uri="http://schemas.microsoft.com/office/2006/metadata/properties"/>
+    <ds:schemaRef ds:uri="http://schemas.microsoft.com/office/infopath/2007/PartnerControls"/>
+    <ds:schemaRef ds:uri="01b6a1d5-879d-44ed-91a0-31c394f626b4"/>
+    <ds:schemaRef ds:uri="57eaa26b-6fb5-4fc8-8b16-530ac3965dc8"/>
+  </ds:schemaRefs>
+</ds:datastoreItem>
 </file>
</xml_diff>